<commit_message>
docs: integrate TV4 evidence and fix Word tables
</commit_message>
<xml_diff>
--- a/Bo_nop_TV4_NguyenQuangVinh/TV4_Phan_Bao_Cao.docx
+++ b/Bo_nop_TV4_NguyenQuangVinh/TV4_Phan_Bao_Cao.docx
@@ -90,11 +90,11 @@
         </w:tblCellMar>
       </w:tblPr>
       <w:tblGrid>
-        <w:gridCol w:w="1900"/>
-        <w:gridCol w:w="1550"/>
-        <w:gridCol w:w="700"/>
-        <w:gridCol w:w="1700"/>
-        <w:gridCol w:w="3850"/>
+        <w:gridCol w:w="2117"/>
+        <w:gridCol w:w="1872"/>
+        <w:gridCol w:w="950"/>
+        <w:gridCol w:w="1843"/>
+        <w:gridCol w:w="2918"/>
       </w:tblGrid>
       <w:tr>
         <w:trPr>
@@ -103,7 +103,7 @@
         </w:trPr>
         <w:tc>
           <w:tcPr>
-            <w:tcW w:w="1900" w:type="dxa"/>
+            <w:tcW w:w="2117" w:type="dxa"/>
             <w:shd w:fill="EDEDED"/>
           </w:tcPr>
           <w:p>
@@ -117,7 +117,7 @@
                 <w:rFonts w:ascii="Times New Roman" w:hAnsi="Times New Roman" w:eastAsia="Times New Roman" w:cs="Times New Roman"/>
                 <w:b/>
                 <w:color w:val="000000"/>
-                <w:sz w:val="24"/>
+                <w:sz w:val="22"/>
                 <w:szCs w:val="24"/>
               </w:rPr>
               <w:t xml:space="preserve">Cột</w:t>
@@ -126,7 +126,7 @@
         </w:tc>
         <w:tc>
           <w:tcPr>
-            <w:tcW w:w="1550" w:type="dxa"/>
+            <w:tcW w:w="1872" w:type="dxa"/>
             <w:shd w:fill="EDEDED"/>
           </w:tcPr>
           <w:p>
@@ -140,7 +140,7 @@
                 <w:rFonts w:ascii="Times New Roman" w:hAnsi="Times New Roman" w:eastAsia="Times New Roman" w:cs="Times New Roman"/>
                 <w:b/>
                 <w:color w:val="000000"/>
-                <w:sz w:val="24"/>
+                <w:sz w:val="22"/>
                 <w:szCs w:val="24"/>
               </w:rPr>
               <w:t xml:space="preserve">Kiểu</w:t>
@@ -149,7 +149,7 @@
         </w:tc>
         <w:tc>
           <w:tcPr>
-            <w:tcW w:w="700" w:type="dxa"/>
+            <w:tcW w:w="950" w:type="dxa"/>
             <w:shd w:fill="EDEDED"/>
           </w:tcPr>
           <w:p>
@@ -163,7 +163,7 @@
                 <w:rFonts w:ascii="Times New Roman" w:hAnsi="Times New Roman" w:eastAsia="Times New Roman" w:cs="Times New Roman"/>
                 <w:b/>
                 <w:color w:val="000000"/>
-                <w:sz w:val="24"/>
+                <w:sz w:val="22"/>
                 <w:szCs w:val="24"/>
               </w:rPr>
               <w:t xml:space="preserve">NULL</w:t>
@@ -172,7 +172,7 @@
         </w:tc>
         <w:tc>
           <w:tcPr>
-            <w:tcW w:w="1700" w:type="dxa"/>
+            <w:tcW w:w="1843" w:type="dxa"/>
             <w:shd w:fill="EDEDED"/>
           </w:tcPr>
           <w:p>
@@ -186,7 +186,7 @@
                 <w:rFonts w:ascii="Times New Roman" w:hAnsi="Times New Roman" w:eastAsia="Times New Roman" w:cs="Times New Roman"/>
                 <w:b/>
                 <w:color w:val="000000"/>
-                <w:sz w:val="24"/>
+                <w:sz w:val="22"/>
                 <w:szCs w:val="24"/>
               </w:rPr>
               <w:t xml:space="preserve">Mặc định</w:t>
@@ -195,7 +195,7 @@
         </w:tc>
         <w:tc>
           <w:tcPr>
-            <w:tcW w:w="3850" w:type="dxa"/>
+            <w:tcW w:w="2918" w:type="dxa"/>
             <w:shd w:fill="EDEDED"/>
           </w:tcPr>
           <w:p>
@@ -209,7 +209,7 @@
                 <w:rFonts w:ascii="Times New Roman" w:hAnsi="Times New Roman" w:eastAsia="Times New Roman" w:cs="Times New Roman"/>
                 <w:b/>
                 <w:color w:val="000000"/>
-                <w:sz w:val="24"/>
+                <w:sz w:val="22"/>
                 <w:szCs w:val="24"/>
               </w:rPr>
               <w:t xml:space="preserve">Ràng buộc / ý nghĩa</w:t>
@@ -223,19 +223,19 @@
         </w:trPr>
         <w:tc>
           <w:tcPr>
-            <w:tcW w:w="1900" w:type="dxa"/>
-          </w:tcPr>
-          <w:p>
-            <w:pPr>
-              <w:pStyle w:val="Normal"/>
-              <w:spacing w:after="0" w:line="240" w:lineRule="auto"/>
-              <w:outlineLvl w:val="9"/>
-            </w:pPr>
-            <w:r>
-              <w:rPr>
-                <w:rFonts w:ascii="Times New Roman" w:hAnsi="Times New Roman" w:eastAsia="Times New Roman" w:cs="Times New Roman"/>
-                <w:color w:val="000000"/>
-                <w:sz w:val="24"/>
+            <w:tcW w:w="2117" w:type="dxa"/>
+          </w:tcPr>
+          <w:p>
+            <w:pPr>
+              <w:pStyle w:val="Normal"/>
+              <w:spacing w:after="0" w:line="240" w:lineRule="auto"/>
+              <w:outlineLvl w:val="9"/>
+            </w:pPr>
+            <w:r>
+              <w:rPr>
+                <w:rFonts w:ascii="Times New Roman" w:hAnsi="Times New Roman" w:eastAsia="Times New Roman" w:cs="Times New Roman"/>
+                <w:color w:val="000000"/>
+                <w:sz w:val="22"/>
                 <w:szCs w:val="24"/>
               </w:rPr>
               <w:t xml:space="preserve">MaBangLuong</w:t>
@@ -244,19 +244,19 @@
         </w:tc>
         <w:tc>
           <w:tcPr>
-            <w:tcW w:w="1550" w:type="dxa"/>
-          </w:tcPr>
-          <w:p>
-            <w:pPr>
-              <w:pStyle w:val="Normal"/>
-              <w:spacing w:after="0" w:line="240" w:lineRule="auto"/>
-              <w:outlineLvl w:val="9"/>
-            </w:pPr>
-            <w:r>
-              <w:rPr>
-                <w:rFonts w:ascii="Times New Roman" w:hAnsi="Times New Roman" w:eastAsia="Times New Roman" w:cs="Times New Roman"/>
-                <w:color w:val="000000"/>
-                <w:sz w:val="24"/>
+            <w:tcW w:w="1872" w:type="dxa"/>
+          </w:tcPr>
+          <w:p>
+            <w:pPr>
+              <w:pStyle w:val="Normal"/>
+              <w:spacing w:after="0" w:line="240" w:lineRule="auto"/>
+              <w:outlineLvl w:val="9"/>
+            </w:pPr>
+            <w:r>
+              <w:rPr>
+                <w:rFonts w:ascii="Times New Roman" w:hAnsi="Times New Roman" w:eastAsia="Times New Roman" w:cs="Times New Roman"/>
+                <w:color w:val="000000"/>
+                <w:sz w:val="22"/>
                 <w:szCs w:val="24"/>
               </w:rPr>
               <w:t xml:space="preserve">INT</w:t>
@@ -265,19 +265,19 @@
         </w:tc>
         <w:tc>
           <w:tcPr>
-            <w:tcW w:w="700" w:type="dxa"/>
-          </w:tcPr>
-          <w:p>
-            <w:pPr>
-              <w:pStyle w:val="Normal"/>
-              <w:spacing w:after="0" w:line="240" w:lineRule="auto"/>
-              <w:outlineLvl w:val="9"/>
-            </w:pPr>
-            <w:r>
-              <w:rPr>
-                <w:rFonts w:ascii="Times New Roman" w:hAnsi="Times New Roman" w:eastAsia="Times New Roman" w:cs="Times New Roman"/>
-                <w:color w:val="000000"/>
-                <w:sz w:val="24"/>
+            <w:tcW w:w="950" w:type="dxa"/>
+          </w:tcPr>
+          <w:p>
+            <w:pPr>
+              <w:pStyle w:val="Normal"/>
+              <w:spacing w:after="0" w:line="240" w:lineRule="auto"/>
+              <w:outlineLvl w:val="9"/>
+            </w:pPr>
+            <w:r>
+              <w:rPr>
+                <w:rFonts w:ascii="Times New Roman" w:hAnsi="Times New Roman" w:eastAsia="Times New Roman" w:cs="Times New Roman"/>
+                <w:color w:val="000000"/>
+                <w:sz w:val="22"/>
                 <w:szCs w:val="24"/>
               </w:rPr>
               <w:t xml:space="preserve">Không</w:t>
@@ -286,19 +286,19 @@
         </w:tc>
         <w:tc>
           <w:tcPr>
-            <w:tcW w:w="1700" w:type="dxa"/>
-          </w:tcPr>
-          <w:p>
-            <w:pPr>
-              <w:pStyle w:val="Normal"/>
-              <w:spacing w:after="0" w:line="240" w:lineRule="auto"/>
-              <w:outlineLvl w:val="9"/>
-            </w:pPr>
-            <w:r>
-              <w:rPr>
-                <w:rFonts w:ascii="Times New Roman" w:hAnsi="Times New Roman" w:eastAsia="Times New Roman" w:cs="Times New Roman"/>
-                <w:color w:val="000000"/>
-                <w:sz w:val="24"/>
+            <w:tcW w:w="1843" w:type="dxa"/>
+          </w:tcPr>
+          <w:p>
+            <w:pPr>
+              <w:pStyle w:val="Normal"/>
+              <w:spacing w:after="0" w:line="240" w:lineRule="auto"/>
+              <w:outlineLvl w:val="9"/>
+            </w:pPr>
+            <w:r>
+              <w:rPr>
+                <w:rFonts w:ascii="Times New Roman" w:hAnsi="Times New Roman" w:eastAsia="Times New Roman" w:cs="Times New Roman"/>
+                <w:color w:val="000000"/>
+                <w:sz w:val="22"/>
                 <w:szCs w:val="24"/>
               </w:rPr>
               <w:t xml:space="preserve">IDENTITY(1,1)</w:t>
@@ -307,19 +307,19 @@
         </w:tc>
         <w:tc>
           <w:tcPr>
-            <w:tcW w:w="3850" w:type="dxa"/>
-          </w:tcPr>
-          <w:p>
-            <w:pPr>
-              <w:pStyle w:val="Normal"/>
-              <w:spacing w:after="0" w:line="240" w:lineRule="auto"/>
-              <w:outlineLvl w:val="9"/>
-            </w:pPr>
-            <w:r>
-              <w:rPr>
-                <w:rFonts w:ascii="Times New Roman" w:hAnsi="Times New Roman" w:eastAsia="Times New Roman" w:cs="Times New Roman"/>
-                <w:color w:val="000000"/>
-                <w:sz w:val="24"/>
+            <w:tcW w:w="2918" w:type="dxa"/>
+          </w:tcPr>
+          <w:p>
+            <w:pPr>
+              <w:pStyle w:val="Normal"/>
+              <w:spacing w:after="0" w:line="240" w:lineRule="auto"/>
+              <w:outlineLvl w:val="9"/>
+            </w:pPr>
+            <w:r>
+              <w:rPr>
+                <w:rFonts w:ascii="Times New Roman" w:hAnsi="Times New Roman" w:eastAsia="Times New Roman" w:cs="Times New Roman"/>
+                <w:color w:val="000000"/>
+                <w:sz w:val="22"/>
                 <w:szCs w:val="24"/>
               </w:rPr>
               <w:t xml:space="preserve">PK clustered; mã kỳ</w:t>
@@ -333,19 +333,19 @@
         </w:trPr>
         <w:tc>
           <w:tcPr>
-            <w:tcW w:w="1900" w:type="dxa"/>
-          </w:tcPr>
-          <w:p>
-            <w:pPr>
-              <w:pStyle w:val="Normal"/>
-              <w:spacing w:after="0" w:line="240" w:lineRule="auto"/>
-              <w:outlineLvl w:val="9"/>
-            </w:pPr>
-            <w:r>
-              <w:rPr>
-                <w:rFonts w:ascii="Times New Roman" w:hAnsi="Times New Roman" w:eastAsia="Times New Roman" w:cs="Times New Roman"/>
-                <w:color w:val="000000"/>
-                <w:sz w:val="24"/>
+            <w:tcW w:w="2117" w:type="dxa"/>
+          </w:tcPr>
+          <w:p>
+            <w:pPr>
+              <w:pStyle w:val="Normal"/>
+              <w:spacing w:after="0" w:line="240" w:lineRule="auto"/>
+              <w:outlineLvl w:val="9"/>
+            </w:pPr>
+            <w:r>
+              <w:rPr>
+                <w:rFonts w:ascii="Times New Roman" w:hAnsi="Times New Roman" w:eastAsia="Times New Roman" w:cs="Times New Roman"/>
+                <w:color w:val="000000"/>
+                <w:sz w:val="22"/>
                 <w:szCs w:val="24"/>
               </w:rPr>
               <w:t xml:space="preserve">Thang</w:t>
@@ -354,19 +354,19 @@
         </w:tc>
         <w:tc>
           <w:tcPr>
-            <w:tcW w:w="1550" w:type="dxa"/>
-          </w:tcPr>
-          <w:p>
-            <w:pPr>
-              <w:pStyle w:val="Normal"/>
-              <w:spacing w:after="0" w:line="240" w:lineRule="auto"/>
-              <w:outlineLvl w:val="9"/>
-            </w:pPr>
-            <w:r>
-              <w:rPr>
-                <w:rFonts w:ascii="Times New Roman" w:hAnsi="Times New Roman" w:eastAsia="Times New Roman" w:cs="Times New Roman"/>
-                <w:color w:val="000000"/>
-                <w:sz w:val="24"/>
+            <w:tcW w:w="1872" w:type="dxa"/>
+          </w:tcPr>
+          <w:p>
+            <w:pPr>
+              <w:pStyle w:val="Normal"/>
+              <w:spacing w:after="0" w:line="240" w:lineRule="auto"/>
+              <w:outlineLvl w:val="9"/>
+            </w:pPr>
+            <w:r>
+              <w:rPr>
+                <w:rFonts w:ascii="Times New Roman" w:hAnsi="Times New Roman" w:eastAsia="Times New Roman" w:cs="Times New Roman"/>
+                <w:color w:val="000000"/>
+                <w:sz w:val="22"/>
                 <w:szCs w:val="24"/>
               </w:rPr>
               <w:t xml:space="preserve">INT</w:t>
@@ -375,19 +375,19 @@
         </w:tc>
         <w:tc>
           <w:tcPr>
-            <w:tcW w:w="700" w:type="dxa"/>
-          </w:tcPr>
-          <w:p>
-            <w:pPr>
-              <w:pStyle w:val="Normal"/>
-              <w:spacing w:after="0" w:line="240" w:lineRule="auto"/>
-              <w:outlineLvl w:val="9"/>
-            </w:pPr>
-            <w:r>
-              <w:rPr>
-                <w:rFonts w:ascii="Times New Roman" w:hAnsi="Times New Roman" w:eastAsia="Times New Roman" w:cs="Times New Roman"/>
-                <w:color w:val="000000"/>
-                <w:sz w:val="24"/>
+            <w:tcW w:w="950" w:type="dxa"/>
+          </w:tcPr>
+          <w:p>
+            <w:pPr>
+              <w:pStyle w:val="Normal"/>
+              <w:spacing w:after="0" w:line="240" w:lineRule="auto"/>
+              <w:outlineLvl w:val="9"/>
+            </w:pPr>
+            <w:r>
+              <w:rPr>
+                <w:rFonts w:ascii="Times New Roman" w:hAnsi="Times New Roman" w:eastAsia="Times New Roman" w:cs="Times New Roman"/>
+                <w:color w:val="000000"/>
+                <w:sz w:val="22"/>
                 <w:szCs w:val="24"/>
               </w:rPr>
               <w:t xml:space="preserve">Không</w:t>
@@ -396,19 +396,19 @@
         </w:tc>
         <w:tc>
           <w:tcPr>
-            <w:tcW w:w="1700" w:type="dxa"/>
-          </w:tcPr>
-          <w:p>
-            <w:pPr>
-              <w:pStyle w:val="Normal"/>
-              <w:spacing w:after="0" w:line="240" w:lineRule="auto"/>
-              <w:outlineLvl w:val="9"/>
-            </w:pPr>
-            <w:r>
-              <w:rPr>
-                <w:rFonts w:ascii="Times New Roman" w:hAnsi="Times New Roman" w:eastAsia="Times New Roman" w:cs="Times New Roman"/>
-                <w:color w:val="000000"/>
-                <w:sz w:val="24"/>
+            <w:tcW w:w="1843" w:type="dxa"/>
+          </w:tcPr>
+          <w:p>
+            <w:pPr>
+              <w:pStyle w:val="Normal"/>
+              <w:spacing w:after="0" w:line="240" w:lineRule="auto"/>
+              <w:outlineLvl w:val="9"/>
+            </w:pPr>
+            <w:r>
+              <w:rPr>
+                <w:rFonts w:ascii="Times New Roman" w:hAnsi="Times New Roman" w:eastAsia="Times New Roman" w:cs="Times New Roman"/>
+                <w:color w:val="000000"/>
+                <w:sz w:val="22"/>
                 <w:szCs w:val="24"/>
               </w:rPr>
               <w:t xml:space="preserve">Không</w:t>
@@ -417,19 +417,19 @@
         </w:tc>
         <w:tc>
           <w:tcPr>
-            <w:tcW w:w="3850" w:type="dxa"/>
-          </w:tcPr>
-          <w:p>
-            <w:pPr>
-              <w:pStyle w:val="Normal"/>
-              <w:spacing w:after="0" w:line="240" w:lineRule="auto"/>
-              <w:outlineLvl w:val="9"/>
-            </w:pPr>
-            <w:r>
-              <w:rPr>
-                <w:rFonts w:ascii="Times New Roman" w:hAnsi="Times New Roman" w:eastAsia="Times New Roman" w:cs="Times New Roman"/>
-                <w:color w:val="000000"/>
-                <w:sz w:val="24"/>
+            <w:tcW w:w="2918" w:type="dxa"/>
+          </w:tcPr>
+          <w:p>
+            <w:pPr>
+              <w:pStyle w:val="Normal"/>
+              <w:spacing w:after="0" w:line="240" w:lineRule="auto"/>
+              <w:outlineLvl w:val="9"/>
+            </w:pPr>
+            <w:r>
+              <w:rPr>
+                <w:rFonts w:ascii="Times New Roman" w:hAnsi="Times New Roman" w:eastAsia="Times New Roman" w:cs="Times New Roman"/>
+                <w:color w:val="000000"/>
+                <w:sz w:val="22"/>
                 <w:szCs w:val="24"/>
               </w:rPr>
               <w:t xml:space="preserve">CHECK 1–12; UNIQUE cùng Nam</w:t>
@@ -443,19 +443,19 @@
         </w:trPr>
         <w:tc>
           <w:tcPr>
-            <w:tcW w:w="1900" w:type="dxa"/>
-          </w:tcPr>
-          <w:p>
-            <w:pPr>
-              <w:pStyle w:val="Normal"/>
-              <w:spacing w:after="0" w:line="240" w:lineRule="auto"/>
-              <w:outlineLvl w:val="9"/>
-            </w:pPr>
-            <w:r>
-              <w:rPr>
-                <w:rFonts w:ascii="Times New Roman" w:hAnsi="Times New Roman" w:eastAsia="Times New Roman" w:cs="Times New Roman"/>
-                <w:color w:val="000000"/>
-                <w:sz w:val="24"/>
+            <w:tcW w:w="2117" w:type="dxa"/>
+          </w:tcPr>
+          <w:p>
+            <w:pPr>
+              <w:pStyle w:val="Normal"/>
+              <w:spacing w:after="0" w:line="240" w:lineRule="auto"/>
+              <w:outlineLvl w:val="9"/>
+            </w:pPr>
+            <w:r>
+              <w:rPr>
+                <w:rFonts w:ascii="Times New Roman" w:hAnsi="Times New Roman" w:eastAsia="Times New Roman" w:cs="Times New Roman"/>
+                <w:color w:val="000000"/>
+                <w:sz w:val="22"/>
                 <w:szCs w:val="24"/>
               </w:rPr>
               <w:t xml:space="preserve">Nam</w:t>
@@ -464,19 +464,19 @@
         </w:tc>
         <w:tc>
           <w:tcPr>
-            <w:tcW w:w="1550" w:type="dxa"/>
-          </w:tcPr>
-          <w:p>
-            <w:pPr>
-              <w:pStyle w:val="Normal"/>
-              <w:spacing w:after="0" w:line="240" w:lineRule="auto"/>
-              <w:outlineLvl w:val="9"/>
-            </w:pPr>
-            <w:r>
-              <w:rPr>
-                <w:rFonts w:ascii="Times New Roman" w:hAnsi="Times New Roman" w:eastAsia="Times New Roman" w:cs="Times New Roman"/>
-                <w:color w:val="000000"/>
-                <w:sz w:val="24"/>
+            <w:tcW w:w="1872" w:type="dxa"/>
+          </w:tcPr>
+          <w:p>
+            <w:pPr>
+              <w:pStyle w:val="Normal"/>
+              <w:spacing w:after="0" w:line="240" w:lineRule="auto"/>
+              <w:outlineLvl w:val="9"/>
+            </w:pPr>
+            <w:r>
+              <w:rPr>
+                <w:rFonts w:ascii="Times New Roman" w:hAnsi="Times New Roman" w:eastAsia="Times New Roman" w:cs="Times New Roman"/>
+                <w:color w:val="000000"/>
+                <w:sz w:val="22"/>
                 <w:szCs w:val="24"/>
               </w:rPr>
               <w:t xml:space="preserve">INT</w:t>
@@ -485,19 +485,19 @@
         </w:tc>
         <w:tc>
           <w:tcPr>
-            <w:tcW w:w="700" w:type="dxa"/>
-          </w:tcPr>
-          <w:p>
-            <w:pPr>
-              <w:pStyle w:val="Normal"/>
-              <w:spacing w:after="0" w:line="240" w:lineRule="auto"/>
-              <w:outlineLvl w:val="9"/>
-            </w:pPr>
-            <w:r>
-              <w:rPr>
-                <w:rFonts w:ascii="Times New Roman" w:hAnsi="Times New Roman" w:eastAsia="Times New Roman" w:cs="Times New Roman"/>
-                <w:color w:val="000000"/>
-                <w:sz w:val="24"/>
+            <w:tcW w:w="950" w:type="dxa"/>
+          </w:tcPr>
+          <w:p>
+            <w:pPr>
+              <w:pStyle w:val="Normal"/>
+              <w:spacing w:after="0" w:line="240" w:lineRule="auto"/>
+              <w:outlineLvl w:val="9"/>
+            </w:pPr>
+            <w:r>
+              <w:rPr>
+                <w:rFonts w:ascii="Times New Roman" w:hAnsi="Times New Roman" w:eastAsia="Times New Roman" w:cs="Times New Roman"/>
+                <w:color w:val="000000"/>
+                <w:sz w:val="22"/>
                 <w:szCs w:val="24"/>
               </w:rPr>
               <w:t xml:space="preserve">Không</w:t>
@@ -506,19 +506,19 @@
         </w:tc>
         <w:tc>
           <w:tcPr>
-            <w:tcW w:w="1700" w:type="dxa"/>
-          </w:tcPr>
-          <w:p>
-            <w:pPr>
-              <w:pStyle w:val="Normal"/>
-              <w:spacing w:after="0" w:line="240" w:lineRule="auto"/>
-              <w:outlineLvl w:val="9"/>
-            </w:pPr>
-            <w:r>
-              <w:rPr>
-                <w:rFonts w:ascii="Times New Roman" w:hAnsi="Times New Roman" w:eastAsia="Times New Roman" w:cs="Times New Roman"/>
-                <w:color w:val="000000"/>
-                <w:sz w:val="24"/>
+            <w:tcW w:w="1843" w:type="dxa"/>
+          </w:tcPr>
+          <w:p>
+            <w:pPr>
+              <w:pStyle w:val="Normal"/>
+              <w:spacing w:after="0" w:line="240" w:lineRule="auto"/>
+              <w:outlineLvl w:val="9"/>
+            </w:pPr>
+            <w:r>
+              <w:rPr>
+                <w:rFonts w:ascii="Times New Roman" w:hAnsi="Times New Roman" w:eastAsia="Times New Roman" w:cs="Times New Roman"/>
+                <w:color w:val="000000"/>
+                <w:sz w:val="22"/>
                 <w:szCs w:val="24"/>
               </w:rPr>
               <w:t xml:space="preserve">Không</w:t>
@@ -527,19 +527,19 @@
         </w:tc>
         <w:tc>
           <w:tcPr>
-            <w:tcW w:w="3850" w:type="dxa"/>
-          </w:tcPr>
-          <w:p>
-            <w:pPr>
-              <w:pStyle w:val="Normal"/>
-              <w:spacing w:after="0" w:line="240" w:lineRule="auto"/>
-              <w:outlineLvl w:val="9"/>
-            </w:pPr>
-            <w:r>
-              <w:rPr>
-                <w:rFonts w:ascii="Times New Roman" w:hAnsi="Times New Roman" w:eastAsia="Times New Roman" w:cs="Times New Roman"/>
-                <w:color w:val="000000"/>
-                <w:sz w:val="24"/>
+            <w:tcW w:w="2918" w:type="dxa"/>
+          </w:tcPr>
+          <w:p>
+            <w:pPr>
+              <w:pStyle w:val="Normal"/>
+              <w:spacing w:after="0" w:line="240" w:lineRule="auto"/>
+              <w:outlineLvl w:val="9"/>
+            </w:pPr>
+            <w:r>
+              <w:rPr>
+                <w:rFonts w:ascii="Times New Roman" w:hAnsi="Times New Roman" w:eastAsia="Times New Roman" w:cs="Times New Roman"/>
+                <w:color w:val="000000"/>
+                <w:sz w:val="22"/>
                 <w:szCs w:val="24"/>
               </w:rPr>
               <w:t xml:space="preserve">CHECK 2020–2100; UNIQUE cùng Thang</w:t>
@@ -553,19 +553,19 @@
         </w:trPr>
         <w:tc>
           <w:tcPr>
-            <w:tcW w:w="1900" w:type="dxa"/>
-          </w:tcPr>
-          <w:p>
-            <w:pPr>
-              <w:pStyle w:val="Normal"/>
-              <w:spacing w:after="0" w:line="240" w:lineRule="auto"/>
-              <w:outlineLvl w:val="9"/>
-            </w:pPr>
-            <w:r>
-              <w:rPr>
-                <w:rFonts w:ascii="Times New Roman" w:hAnsi="Times New Roman" w:eastAsia="Times New Roman" w:cs="Times New Roman"/>
-                <w:color w:val="000000"/>
-                <w:sz w:val="24"/>
+            <w:tcW w:w="2117" w:type="dxa"/>
+          </w:tcPr>
+          <w:p>
+            <w:pPr>
+              <w:pStyle w:val="Normal"/>
+              <w:spacing w:after="0" w:line="240" w:lineRule="auto"/>
+              <w:outlineLvl w:val="9"/>
+            </w:pPr>
+            <w:r>
+              <w:rPr>
+                <w:rFonts w:ascii="Times New Roman" w:hAnsi="Times New Roman" w:eastAsia="Times New Roman" w:cs="Times New Roman"/>
+                <w:color w:val="000000"/>
+                <w:sz w:val="22"/>
                 <w:szCs w:val="24"/>
               </w:rPr>
               <w:t xml:space="preserve">NgayCongChuan</w:t>
@@ -574,19 +574,19 @@
         </w:tc>
         <w:tc>
           <w:tcPr>
-            <w:tcW w:w="1550" w:type="dxa"/>
-          </w:tcPr>
-          <w:p>
-            <w:pPr>
-              <w:pStyle w:val="Normal"/>
-              <w:spacing w:after="0" w:line="240" w:lineRule="auto"/>
-              <w:outlineLvl w:val="9"/>
-            </w:pPr>
-            <w:r>
-              <w:rPr>
-                <w:rFonts w:ascii="Times New Roman" w:hAnsi="Times New Roman" w:eastAsia="Times New Roman" w:cs="Times New Roman"/>
-                <w:color w:val="000000"/>
-                <w:sz w:val="24"/>
+            <w:tcW w:w="1872" w:type="dxa"/>
+          </w:tcPr>
+          <w:p>
+            <w:pPr>
+              <w:pStyle w:val="Normal"/>
+              <w:spacing w:after="0" w:line="240" w:lineRule="auto"/>
+              <w:outlineLvl w:val="9"/>
+            </w:pPr>
+            <w:r>
+              <w:rPr>
+                <w:rFonts w:ascii="Times New Roman" w:hAnsi="Times New Roman" w:eastAsia="Times New Roman" w:cs="Times New Roman"/>
+                <w:color w:val="000000"/>
+                <w:sz w:val="22"/>
                 <w:szCs w:val="24"/>
               </w:rPr>
               <w:t xml:space="preserve">INT</w:t>
@@ -595,19 +595,19 @@
         </w:tc>
         <w:tc>
           <w:tcPr>
-            <w:tcW w:w="700" w:type="dxa"/>
-          </w:tcPr>
-          <w:p>
-            <w:pPr>
-              <w:pStyle w:val="Normal"/>
-              <w:spacing w:after="0" w:line="240" w:lineRule="auto"/>
-              <w:outlineLvl w:val="9"/>
-            </w:pPr>
-            <w:r>
-              <w:rPr>
-                <w:rFonts w:ascii="Times New Roman" w:hAnsi="Times New Roman" w:eastAsia="Times New Roman" w:cs="Times New Roman"/>
-                <w:color w:val="000000"/>
-                <w:sz w:val="24"/>
+            <w:tcW w:w="950" w:type="dxa"/>
+          </w:tcPr>
+          <w:p>
+            <w:pPr>
+              <w:pStyle w:val="Normal"/>
+              <w:spacing w:after="0" w:line="240" w:lineRule="auto"/>
+              <w:outlineLvl w:val="9"/>
+            </w:pPr>
+            <w:r>
+              <w:rPr>
+                <w:rFonts w:ascii="Times New Roman" w:hAnsi="Times New Roman" w:eastAsia="Times New Roman" w:cs="Times New Roman"/>
+                <w:color w:val="000000"/>
+                <w:sz w:val="22"/>
                 <w:szCs w:val="24"/>
               </w:rPr>
               <w:t xml:space="preserve">Không</w:t>
@@ -616,19 +616,19 @@
         </w:tc>
         <w:tc>
           <w:tcPr>
-            <w:tcW w:w="1700" w:type="dxa"/>
-          </w:tcPr>
-          <w:p>
-            <w:pPr>
-              <w:pStyle w:val="Normal"/>
-              <w:spacing w:after="0" w:line="240" w:lineRule="auto"/>
-              <w:outlineLvl w:val="9"/>
-            </w:pPr>
-            <w:r>
-              <w:rPr>
-                <w:rFonts w:ascii="Times New Roman" w:hAnsi="Times New Roman" w:eastAsia="Times New Roman" w:cs="Times New Roman"/>
-                <w:color w:val="000000"/>
-                <w:sz w:val="24"/>
+            <w:tcW w:w="1843" w:type="dxa"/>
+          </w:tcPr>
+          <w:p>
+            <w:pPr>
+              <w:pStyle w:val="Normal"/>
+              <w:spacing w:after="0" w:line="240" w:lineRule="auto"/>
+              <w:outlineLvl w:val="9"/>
+            </w:pPr>
+            <w:r>
+              <w:rPr>
+                <w:rFonts w:ascii="Times New Roman" w:hAnsi="Times New Roman" w:eastAsia="Times New Roman" w:cs="Times New Roman"/>
+                <w:color w:val="000000"/>
+                <w:sz w:val="22"/>
                 <w:szCs w:val="24"/>
               </w:rPr>
               <w:t xml:space="preserve">26</w:t>
@@ -637,19 +637,19 @@
         </w:tc>
         <w:tc>
           <w:tcPr>
-            <w:tcW w:w="3850" w:type="dxa"/>
-          </w:tcPr>
-          <w:p>
-            <w:pPr>
-              <w:pStyle w:val="Normal"/>
-              <w:spacing w:after="0" w:line="240" w:lineRule="auto"/>
-              <w:outlineLvl w:val="9"/>
-            </w:pPr>
-            <w:r>
-              <w:rPr>
-                <w:rFonts w:ascii="Times New Roman" w:hAnsi="Times New Roman" w:eastAsia="Times New Roman" w:cs="Times New Roman"/>
-                <w:color w:val="000000"/>
-                <w:sz w:val="24"/>
+            <w:tcW w:w="2918" w:type="dxa"/>
+          </w:tcPr>
+          <w:p>
+            <w:pPr>
+              <w:pStyle w:val="Normal"/>
+              <w:spacing w:after="0" w:line="240" w:lineRule="auto"/>
+              <w:outlineLvl w:val="9"/>
+            </w:pPr>
+            <w:r>
+              <w:rPr>
+                <w:rFonts w:ascii="Times New Roman" w:hAnsi="Times New Roman" w:eastAsia="Times New Roman" w:cs="Times New Roman"/>
+                <w:color w:val="000000"/>
+                <w:sz w:val="22"/>
                 <w:szCs w:val="24"/>
               </w:rPr>
               <w:t xml:space="preserve">CHECK &gt; 0; công chuẩn của kỳ</w:t>
@@ -663,19 +663,19 @@
         </w:trPr>
         <w:tc>
           <w:tcPr>
-            <w:tcW w:w="1900" w:type="dxa"/>
-          </w:tcPr>
-          <w:p>
-            <w:pPr>
-              <w:pStyle w:val="Normal"/>
-              <w:spacing w:after="0" w:line="240" w:lineRule="auto"/>
-              <w:outlineLvl w:val="9"/>
-            </w:pPr>
-            <w:r>
-              <w:rPr>
-                <w:rFonts w:ascii="Times New Roman" w:hAnsi="Times New Roman" w:eastAsia="Times New Roman" w:cs="Times New Roman"/>
-                <w:color w:val="000000"/>
-                <w:sz w:val="24"/>
+            <w:tcW w:w="2117" w:type="dxa"/>
+          </w:tcPr>
+          <w:p>
+            <w:pPr>
+              <w:pStyle w:val="Normal"/>
+              <w:spacing w:after="0" w:line="240" w:lineRule="auto"/>
+              <w:outlineLvl w:val="9"/>
+            </w:pPr>
+            <w:r>
+              <w:rPr>
+                <w:rFonts w:ascii="Times New Roman" w:hAnsi="Times New Roman" w:eastAsia="Times New Roman" w:cs="Times New Roman"/>
+                <w:color w:val="000000"/>
+                <w:sz w:val="22"/>
                 <w:szCs w:val="24"/>
               </w:rPr>
               <w:t xml:space="preserve">TrangThai</w:t>
@@ -684,19 +684,19 @@
         </w:tc>
         <w:tc>
           <w:tcPr>
-            <w:tcW w:w="1550" w:type="dxa"/>
-          </w:tcPr>
-          <w:p>
-            <w:pPr>
-              <w:pStyle w:val="Normal"/>
-              <w:spacing w:after="0" w:line="240" w:lineRule="auto"/>
-              <w:outlineLvl w:val="9"/>
-            </w:pPr>
-            <w:r>
-              <w:rPr>
-                <w:rFonts w:ascii="Times New Roman" w:hAnsi="Times New Roman" w:eastAsia="Times New Roman" w:cs="Times New Roman"/>
-                <w:color w:val="000000"/>
-                <w:sz w:val="24"/>
+            <w:tcW w:w="1872" w:type="dxa"/>
+          </w:tcPr>
+          <w:p>
+            <w:pPr>
+              <w:pStyle w:val="Normal"/>
+              <w:spacing w:after="0" w:line="240" w:lineRule="auto"/>
+              <w:outlineLvl w:val="9"/>
+            </w:pPr>
+            <w:r>
+              <w:rPr>
+                <w:rFonts w:ascii="Times New Roman" w:hAnsi="Times New Roman" w:eastAsia="Times New Roman" w:cs="Times New Roman"/>
+                <w:color w:val="000000"/>
+                <w:sz w:val="22"/>
                 <w:szCs w:val="24"/>
               </w:rPr>
               <w:t xml:space="preserve">VARCHAR(15)</w:t>
@@ -705,19 +705,19 @@
         </w:tc>
         <w:tc>
           <w:tcPr>
-            <w:tcW w:w="700" w:type="dxa"/>
-          </w:tcPr>
-          <w:p>
-            <w:pPr>
-              <w:pStyle w:val="Normal"/>
-              <w:spacing w:after="0" w:line="240" w:lineRule="auto"/>
-              <w:outlineLvl w:val="9"/>
-            </w:pPr>
-            <w:r>
-              <w:rPr>
-                <w:rFonts w:ascii="Times New Roman" w:hAnsi="Times New Roman" w:eastAsia="Times New Roman" w:cs="Times New Roman"/>
-                <w:color w:val="000000"/>
-                <w:sz w:val="24"/>
+            <w:tcW w:w="950" w:type="dxa"/>
+          </w:tcPr>
+          <w:p>
+            <w:pPr>
+              <w:pStyle w:val="Normal"/>
+              <w:spacing w:after="0" w:line="240" w:lineRule="auto"/>
+              <w:outlineLvl w:val="9"/>
+            </w:pPr>
+            <w:r>
+              <w:rPr>
+                <w:rFonts w:ascii="Times New Roman" w:hAnsi="Times New Roman" w:eastAsia="Times New Roman" w:cs="Times New Roman"/>
+                <w:color w:val="000000"/>
+                <w:sz w:val="22"/>
                 <w:szCs w:val="24"/>
               </w:rPr>
               <w:t xml:space="preserve">Không</w:t>
@@ -726,19 +726,19 @@
         </w:tc>
         <w:tc>
           <w:tcPr>
-            <w:tcW w:w="1700" w:type="dxa"/>
-          </w:tcPr>
-          <w:p>
-            <w:pPr>
-              <w:pStyle w:val="Normal"/>
-              <w:spacing w:after="0" w:line="240" w:lineRule="auto"/>
-              <w:outlineLvl w:val="9"/>
-            </w:pPr>
-            <w:r>
-              <w:rPr>
-                <w:rFonts w:ascii="Times New Roman" w:hAnsi="Times New Roman" w:eastAsia="Times New Roman" w:cs="Times New Roman"/>
-                <w:color w:val="000000"/>
-                <w:sz w:val="24"/>
+            <w:tcW w:w="1843" w:type="dxa"/>
+          </w:tcPr>
+          <w:p>
+            <w:pPr>
+              <w:pStyle w:val="Normal"/>
+              <w:spacing w:after="0" w:line="240" w:lineRule="auto"/>
+              <w:outlineLvl w:val="9"/>
+            </w:pPr>
+            <w:r>
+              <w:rPr>
+                <w:rFonts w:ascii="Times New Roman" w:hAnsi="Times New Roman" w:eastAsia="Times New Roman" w:cs="Times New Roman"/>
+                <w:color w:val="000000"/>
+                <w:sz w:val="22"/>
                 <w:szCs w:val="24"/>
               </w:rPr>
               <w:t xml:space="preserve">'CHUA_CHOT'</w:t>
@@ -747,19 +747,19 @@
         </w:tc>
         <w:tc>
           <w:tcPr>
-            <w:tcW w:w="3850" w:type="dxa"/>
-          </w:tcPr>
-          <w:p>
-            <w:pPr>
-              <w:pStyle w:val="Normal"/>
-              <w:spacing w:after="0" w:line="240" w:lineRule="auto"/>
-              <w:outlineLvl w:val="9"/>
-            </w:pPr>
-            <w:r>
-              <w:rPr>
-                <w:rFonts w:ascii="Times New Roman" w:hAnsi="Times New Roman" w:eastAsia="Times New Roman" w:cs="Times New Roman"/>
-                <w:color w:val="000000"/>
-                <w:sz w:val="24"/>
+            <w:tcW w:w="2918" w:type="dxa"/>
+          </w:tcPr>
+          <w:p>
+            <w:pPr>
+              <w:pStyle w:val="Normal"/>
+              <w:spacing w:after="0" w:line="240" w:lineRule="auto"/>
+              <w:outlineLvl w:val="9"/>
+            </w:pPr>
+            <w:r>
+              <w:rPr>
+                <w:rFonts w:ascii="Times New Roman" w:hAnsi="Times New Roman" w:eastAsia="Times New Roman" w:cs="Times New Roman"/>
+                <w:color w:val="000000"/>
+                <w:sz w:val="22"/>
                 <w:szCs w:val="24"/>
               </w:rPr>
               <w:t xml:space="preserve">CHECK IN ('CHUA_CHOT','DA_CHOT')</w:t>
@@ -773,19 +773,19 @@
         </w:trPr>
         <w:tc>
           <w:tcPr>
-            <w:tcW w:w="1900" w:type="dxa"/>
-          </w:tcPr>
-          <w:p>
-            <w:pPr>
-              <w:pStyle w:val="Normal"/>
-              <w:spacing w:after="0" w:line="240" w:lineRule="auto"/>
-              <w:outlineLvl w:val="9"/>
-            </w:pPr>
-            <w:r>
-              <w:rPr>
-                <w:rFonts w:ascii="Times New Roman" w:hAnsi="Times New Roman" w:eastAsia="Times New Roman" w:cs="Times New Roman"/>
-                <w:color w:val="000000"/>
-                <w:sz w:val="24"/>
+            <w:tcW w:w="2117" w:type="dxa"/>
+          </w:tcPr>
+          <w:p>
+            <w:pPr>
+              <w:pStyle w:val="Normal"/>
+              <w:spacing w:after="0" w:line="240" w:lineRule="auto"/>
+              <w:outlineLvl w:val="9"/>
+            </w:pPr>
+            <w:r>
+              <w:rPr>
+                <w:rFonts w:ascii="Times New Roman" w:hAnsi="Times New Roman" w:eastAsia="Times New Roman" w:cs="Times New Roman"/>
+                <w:color w:val="000000"/>
+                <w:sz w:val="22"/>
                 <w:szCs w:val="24"/>
               </w:rPr>
               <w:t xml:space="preserve">NgayTao</w:t>
@@ -794,19 +794,19 @@
         </w:tc>
         <w:tc>
           <w:tcPr>
-            <w:tcW w:w="1550" w:type="dxa"/>
-          </w:tcPr>
-          <w:p>
-            <w:pPr>
-              <w:pStyle w:val="Normal"/>
-              <w:spacing w:after="0" w:line="240" w:lineRule="auto"/>
-              <w:outlineLvl w:val="9"/>
-            </w:pPr>
-            <w:r>
-              <w:rPr>
-                <w:rFonts w:ascii="Times New Roman" w:hAnsi="Times New Roman" w:eastAsia="Times New Roman" w:cs="Times New Roman"/>
-                <w:color w:val="000000"/>
-                <w:sz w:val="24"/>
+            <w:tcW w:w="1872" w:type="dxa"/>
+          </w:tcPr>
+          <w:p>
+            <w:pPr>
+              <w:pStyle w:val="Normal"/>
+              <w:spacing w:after="0" w:line="240" w:lineRule="auto"/>
+              <w:outlineLvl w:val="9"/>
+            </w:pPr>
+            <w:r>
+              <w:rPr>
+                <w:rFonts w:ascii="Times New Roman" w:hAnsi="Times New Roman" w:eastAsia="Times New Roman" w:cs="Times New Roman"/>
+                <w:color w:val="000000"/>
+                <w:sz w:val="22"/>
                 <w:szCs w:val="24"/>
               </w:rPr>
               <w:t xml:space="preserve">DATETIME</w:t>
@@ -815,19 +815,19 @@
         </w:tc>
         <w:tc>
           <w:tcPr>
-            <w:tcW w:w="700" w:type="dxa"/>
-          </w:tcPr>
-          <w:p>
-            <w:pPr>
-              <w:pStyle w:val="Normal"/>
-              <w:spacing w:after="0" w:line="240" w:lineRule="auto"/>
-              <w:outlineLvl w:val="9"/>
-            </w:pPr>
-            <w:r>
-              <w:rPr>
-                <w:rFonts w:ascii="Times New Roman" w:hAnsi="Times New Roman" w:eastAsia="Times New Roman" w:cs="Times New Roman"/>
-                <w:color w:val="000000"/>
-                <w:sz w:val="24"/>
+            <w:tcW w:w="950" w:type="dxa"/>
+          </w:tcPr>
+          <w:p>
+            <w:pPr>
+              <w:pStyle w:val="Normal"/>
+              <w:spacing w:after="0" w:line="240" w:lineRule="auto"/>
+              <w:outlineLvl w:val="9"/>
+            </w:pPr>
+            <w:r>
+              <w:rPr>
+                <w:rFonts w:ascii="Times New Roman" w:hAnsi="Times New Roman" w:eastAsia="Times New Roman" w:cs="Times New Roman"/>
+                <w:color w:val="000000"/>
+                <w:sz w:val="22"/>
                 <w:szCs w:val="24"/>
               </w:rPr>
               <w:t xml:space="preserve">Không</w:t>
@@ -836,19 +836,19 @@
         </w:tc>
         <w:tc>
           <w:tcPr>
-            <w:tcW w:w="1700" w:type="dxa"/>
-          </w:tcPr>
-          <w:p>
-            <w:pPr>
-              <w:pStyle w:val="Normal"/>
-              <w:spacing w:after="0" w:line="240" w:lineRule="auto"/>
-              <w:outlineLvl w:val="9"/>
-            </w:pPr>
-            <w:r>
-              <w:rPr>
-                <w:rFonts w:ascii="Times New Roman" w:hAnsi="Times New Roman" w:eastAsia="Times New Roman" w:cs="Times New Roman"/>
-                <w:color w:val="000000"/>
-                <w:sz w:val="24"/>
+            <w:tcW w:w="1843" w:type="dxa"/>
+          </w:tcPr>
+          <w:p>
+            <w:pPr>
+              <w:pStyle w:val="Normal"/>
+              <w:spacing w:after="0" w:line="240" w:lineRule="auto"/>
+              <w:outlineLvl w:val="9"/>
+            </w:pPr>
+            <w:r>
+              <w:rPr>
+                <w:rFonts w:ascii="Times New Roman" w:hAnsi="Times New Roman" w:eastAsia="Times New Roman" w:cs="Times New Roman"/>
+                <w:color w:val="000000"/>
+                <w:sz w:val="22"/>
                 <w:szCs w:val="24"/>
               </w:rPr>
               <w:t xml:space="preserve">GETDATE()</w:t>
@@ -857,19 +857,19 @@
         </w:tc>
         <w:tc>
           <w:tcPr>
-            <w:tcW w:w="3850" w:type="dxa"/>
-          </w:tcPr>
-          <w:p>
-            <w:pPr>
-              <w:pStyle w:val="Normal"/>
-              <w:spacing w:after="0" w:line="240" w:lineRule="auto"/>
-              <w:outlineLvl w:val="9"/>
-            </w:pPr>
-            <w:r>
-              <w:rPr>
-                <w:rFonts w:ascii="Times New Roman" w:hAnsi="Times New Roman" w:eastAsia="Times New Roman" w:cs="Times New Roman"/>
-                <w:color w:val="000000"/>
-                <w:sz w:val="24"/>
+            <w:tcW w:w="2918" w:type="dxa"/>
+          </w:tcPr>
+          <w:p>
+            <w:pPr>
+              <w:pStyle w:val="Normal"/>
+              <w:spacing w:after="0" w:line="240" w:lineRule="auto"/>
+              <w:outlineLvl w:val="9"/>
+            </w:pPr>
+            <w:r>
+              <w:rPr>
+                <w:rFonts w:ascii="Times New Roman" w:hAnsi="Times New Roman" w:eastAsia="Times New Roman" w:cs="Times New Roman"/>
+                <w:color w:val="000000"/>
+                <w:sz w:val="22"/>
                 <w:szCs w:val="24"/>
               </w:rPr>
               <w:t xml:space="preserve">Ngày tạo hoặc tính lại kỳ nháp</w:t>
@@ -883,19 +883,19 @@
         </w:trPr>
         <w:tc>
           <w:tcPr>
-            <w:tcW w:w="1900" w:type="dxa"/>
-          </w:tcPr>
-          <w:p>
-            <w:pPr>
-              <w:pStyle w:val="Normal"/>
-              <w:spacing w:after="0" w:line="240" w:lineRule="auto"/>
-              <w:outlineLvl w:val="9"/>
-            </w:pPr>
-            <w:r>
-              <w:rPr>
-                <w:rFonts w:ascii="Times New Roman" w:hAnsi="Times New Roman" w:eastAsia="Times New Roman" w:cs="Times New Roman"/>
-                <w:color w:val="000000"/>
-                <w:sz w:val="24"/>
+            <w:tcW w:w="2117" w:type="dxa"/>
+          </w:tcPr>
+          <w:p>
+            <w:pPr>
+              <w:pStyle w:val="Normal"/>
+              <w:spacing w:after="0" w:line="240" w:lineRule="auto"/>
+              <w:outlineLvl w:val="9"/>
+            </w:pPr>
+            <w:r>
+              <w:rPr>
+                <w:rFonts w:ascii="Times New Roman" w:hAnsi="Times New Roman" w:eastAsia="Times New Roman" w:cs="Times New Roman"/>
+                <w:color w:val="000000"/>
+                <w:sz w:val="22"/>
                 <w:szCs w:val="24"/>
               </w:rPr>
               <w:t xml:space="preserve">NgayChot</w:t>
@@ -904,19 +904,19 @@
         </w:tc>
         <w:tc>
           <w:tcPr>
-            <w:tcW w:w="1550" w:type="dxa"/>
-          </w:tcPr>
-          <w:p>
-            <w:pPr>
-              <w:pStyle w:val="Normal"/>
-              <w:spacing w:after="0" w:line="240" w:lineRule="auto"/>
-              <w:outlineLvl w:val="9"/>
-            </w:pPr>
-            <w:r>
-              <w:rPr>
-                <w:rFonts w:ascii="Times New Roman" w:hAnsi="Times New Roman" w:eastAsia="Times New Roman" w:cs="Times New Roman"/>
-                <w:color w:val="000000"/>
-                <w:sz w:val="24"/>
+            <w:tcW w:w="1872" w:type="dxa"/>
+          </w:tcPr>
+          <w:p>
+            <w:pPr>
+              <w:pStyle w:val="Normal"/>
+              <w:spacing w:after="0" w:line="240" w:lineRule="auto"/>
+              <w:outlineLvl w:val="9"/>
+            </w:pPr>
+            <w:r>
+              <w:rPr>
+                <w:rFonts w:ascii="Times New Roman" w:hAnsi="Times New Roman" w:eastAsia="Times New Roman" w:cs="Times New Roman"/>
+                <w:color w:val="000000"/>
+                <w:sz w:val="22"/>
                 <w:szCs w:val="24"/>
               </w:rPr>
               <w:t xml:space="preserve">DATETIME</w:t>
@@ -925,19 +925,19 @@
         </w:tc>
         <w:tc>
           <w:tcPr>
-            <w:tcW w:w="700" w:type="dxa"/>
-          </w:tcPr>
-          <w:p>
-            <w:pPr>
-              <w:pStyle w:val="Normal"/>
-              <w:spacing w:after="0" w:line="240" w:lineRule="auto"/>
-              <w:outlineLvl w:val="9"/>
-            </w:pPr>
-            <w:r>
-              <w:rPr>
-                <w:rFonts w:ascii="Times New Roman" w:hAnsi="Times New Roman" w:eastAsia="Times New Roman" w:cs="Times New Roman"/>
-                <w:color w:val="000000"/>
-                <w:sz w:val="24"/>
+            <w:tcW w:w="950" w:type="dxa"/>
+          </w:tcPr>
+          <w:p>
+            <w:pPr>
+              <w:pStyle w:val="Normal"/>
+              <w:spacing w:after="0" w:line="240" w:lineRule="auto"/>
+              <w:outlineLvl w:val="9"/>
+            </w:pPr>
+            <w:r>
+              <w:rPr>
+                <w:rFonts w:ascii="Times New Roman" w:hAnsi="Times New Roman" w:eastAsia="Times New Roman" w:cs="Times New Roman"/>
+                <w:color w:val="000000"/>
+                <w:sz w:val="22"/>
                 <w:szCs w:val="24"/>
               </w:rPr>
               <w:t xml:space="preserve">Có</w:t>
@@ -946,19 +946,19 @@
         </w:tc>
         <w:tc>
           <w:tcPr>
-            <w:tcW w:w="1700" w:type="dxa"/>
-          </w:tcPr>
-          <w:p>
-            <w:pPr>
-              <w:pStyle w:val="Normal"/>
-              <w:spacing w:after="0" w:line="240" w:lineRule="auto"/>
-              <w:outlineLvl w:val="9"/>
-            </w:pPr>
-            <w:r>
-              <w:rPr>
-                <w:rFonts w:ascii="Times New Roman" w:hAnsi="Times New Roman" w:eastAsia="Times New Roman" w:cs="Times New Roman"/>
-                <w:color w:val="000000"/>
-                <w:sz w:val="24"/>
+            <w:tcW w:w="1843" w:type="dxa"/>
+          </w:tcPr>
+          <w:p>
+            <w:pPr>
+              <w:pStyle w:val="Normal"/>
+              <w:spacing w:after="0" w:line="240" w:lineRule="auto"/>
+              <w:outlineLvl w:val="9"/>
+            </w:pPr>
+            <w:r>
+              <w:rPr>
+                <w:rFonts w:ascii="Times New Roman" w:hAnsi="Times New Roman" w:eastAsia="Times New Roman" w:cs="Times New Roman"/>
+                <w:color w:val="000000"/>
+                <w:sz w:val="22"/>
                 <w:szCs w:val="24"/>
               </w:rPr>
               <w:t xml:space="preserve">Không</w:t>
@@ -967,19 +967,19 @@
         </w:tc>
         <w:tc>
           <w:tcPr>
-            <w:tcW w:w="3850" w:type="dxa"/>
-          </w:tcPr>
-          <w:p>
-            <w:pPr>
-              <w:pStyle w:val="Normal"/>
-              <w:spacing w:after="0" w:line="240" w:lineRule="auto"/>
-              <w:outlineLvl w:val="9"/>
-            </w:pPr>
-            <w:r>
-              <w:rPr>
-                <w:rFonts w:ascii="Times New Roman" w:hAnsi="Times New Roman" w:eastAsia="Times New Roman" w:cs="Times New Roman"/>
-                <w:color w:val="000000"/>
-                <w:sz w:val="24"/>
+            <w:tcW w:w="2918" w:type="dxa"/>
+          </w:tcPr>
+          <w:p>
+            <w:pPr>
+              <w:pStyle w:val="Normal"/>
+              <w:spacing w:after="0" w:line="240" w:lineRule="auto"/>
+              <w:outlineLvl w:val="9"/>
+            </w:pPr>
+            <w:r>
+              <w:rPr>
+                <w:rFonts w:ascii="Times New Roman" w:hAnsi="Times New Roman" w:eastAsia="Times New Roman" w:cs="Times New Roman"/>
+                <w:color w:val="000000"/>
+                <w:sz w:val="22"/>
                 <w:szCs w:val="24"/>
               </w:rPr>
               <w:t xml:space="preserve">Ngày chốt; mở lại đặt NULL</w:t>
@@ -1121,11 +1121,11 @@
         </w:tblCellMar>
       </w:tblPr>
       <w:tblGrid>
-        <w:gridCol w:w="1900"/>
-        <w:gridCol w:w="1550"/>
-        <w:gridCol w:w="700"/>
-        <w:gridCol w:w="1700"/>
-        <w:gridCol w:w="3850"/>
+        <w:gridCol w:w="2117"/>
+        <w:gridCol w:w="1872"/>
+        <w:gridCol w:w="950"/>
+        <w:gridCol w:w="1843"/>
+        <w:gridCol w:w="2918"/>
       </w:tblGrid>
       <w:tr>
         <w:trPr>
@@ -1134,7 +1134,7 @@
         </w:trPr>
         <w:tc>
           <w:tcPr>
-            <w:tcW w:w="1900" w:type="dxa"/>
+            <w:tcW w:w="2117" w:type="dxa"/>
             <w:shd w:fill="EDEDED"/>
           </w:tcPr>
           <w:p>
@@ -1148,7 +1148,7 @@
                 <w:rFonts w:ascii="Times New Roman" w:hAnsi="Times New Roman" w:eastAsia="Times New Roman" w:cs="Times New Roman"/>
                 <w:b/>
                 <w:color w:val="000000"/>
-                <w:sz w:val="24"/>
+                <w:sz w:val="22"/>
                 <w:szCs w:val="24"/>
               </w:rPr>
               <w:t xml:space="preserve">Cột</w:t>
@@ -1157,7 +1157,7 @@
         </w:tc>
         <w:tc>
           <w:tcPr>
-            <w:tcW w:w="1550" w:type="dxa"/>
+            <w:tcW w:w="1872" w:type="dxa"/>
             <w:shd w:fill="EDEDED"/>
           </w:tcPr>
           <w:p>
@@ -1171,7 +1171,7 @@
                 <w:rFonts w:ascii="Times New Roman" w:hAnsi="Times New Roman" w:eastAsia="Times New Roman" w:cs="Times New Roman"/>
                 <w:b/>
                 <w:color w:val="000000"/>
-                <w:sz w:val="24"/>
+                <w:sz w:val="22"/>
                 <w:szCs w:val="24"/>
               </w:rPr>
               <w:t xml:space="preserve">Kiểu</w:t>
@@ -1180,7 +1180,7 @@
         </w:tc>
         <w:tc>
           <w:tcPr>
-            <w:tcW w:w="700" w:type="dxa"/>
+            <w:tcW w:w="950" w:type="dxa"/>
             <w:shd w:fill="EDEDED"/>
           </w:tcPr>
           <w:p>
@@ -1194,7 +1194,7 @@
                 <w:rFonts w:ascii="Times New Roman" w:hAnsi="Times New Roman" w:eastAsia="Times New Roman" w:cs="Times New Roman"/>
                 <w:b/>
                 <w:color w:val="000000"/>
-                <w:sz w:val="24"/>
+                <w:sz w:val="22"/>
                 <w:szCs w:val="24"/>
               </w:rPr>
               <w:t xml:space="preserve">NULL</w:t>
@@ -1203,7 +1203,7 @@
         </w:tc>
         <w:tc>
           <w:tcPr>
-            <w:tcW w:w="1700" w:type="dxa"/>
+            <w:tcW w:w="1843" w:type="dxa"/>
             <w:shd w:fill="EDEDED"/>
           </w:tcPr>
           <w:p>
@@ -1217,7 +1217,7 @@
                 <w:rFonts w:ascii="Times New Roman" w:hAnsi="Times New Roman" w:eastAsia="Times New Roman" w:cs="Times New Roman"/>
                 <w:b/>
                 <w:color w:val="000000"/>
-                <w:sz w:val="24"/>
+                <w:sz w:val="22"/>
                 <w:szCs w:val="24"/>
               </w:rPr>
               <w:t xml:space="preserve">Mặc định</w:t>
@@ -1226,7 +1226,7 @@
         </w:tc>
         <w:tc>
           <w:tcPr>
-            <w:tcW w:w="3850" w:type="dxa"/>
+            <w:tcW w:w="2918" w:type="dxa"/>
             <w:shd w:fill="EDEDED"/>
           </w:tcPr>
           <w:p>
@@ -1240,7 +1240,7 @@
                 <w:rFonts w:ascii="Times New Roman" w:hAnsi="Times New Roman" w:eastAsia="Times New Roman" w:cs="Times New Roman"/>
                 <w:b/>
                 <w:color w:val="000000"/>
-                <w:sz w:val="24"/>
+                <w:sz w:val="22"/>
                 <w:szCs w:val="24"/>
               </w:rPr>
               <w:t xml:space="preserve">Ràng buộc / ý nghĩa</w:t>
@@ -1254,19 +1254,19 @@
         </w:trPr>
         <w:tc>
           <w:tcPr>
-            <w:tcW w:w="1900" w:type="dxa"/>
-          </w:tcPr>
-          <w:p>
-            <w:pPr>
-              <w:pStyle w:val="Normal"/>
-              <w:spacing w:after="0" w:line="240" w:lineRule="auto"/>
-              <w:outlineLvl w:val="9"/>
-            </w:pPr>
-            <w:r>
-              <w:rPr>
-                <w:rFonts w:ascii="Times New Roman" w:hAnsi="Times New Roman" w:eastAsia="Times New Roman" w:cs="Times New Roman"/>
-                <w:color w:val="000000"/>
-                <w:sz w:val="24"/>
+            <w:tcW w:w="2117" w:type="dxa"/>
+          </w:tcPr>
+          <w:p>
+            <w:pPr>
+              <w:pStyle w:val="Normal"/>
+              <w:spacing w:after="0" w:line="240" w:lineRule="auto"/>
+              <w:outlineLvl w:val="9"/>
+            </w:pPr>
+            <w:r>
+              <w:rPr>
+                <w:rFonts w:ascii="Times New Roman" w:hAnsi="Times New Roman" w:eastAsia="Times New Roman" w:cs="Times New Roman"/>
+                <w:color w:val="000000"/>
+                <w:sz w:val="22"/>
                 <w:szCs w:val="24"/>
               </w:rPr>
               <w:t xml:space="preserve">MaChiTiet</w:t>
@@ -1275,19 +1275,19 @@
         </w:tc>
         <w:tc>
           <w:tcPr>
-            <w:tcW w:w="1550" w:type="dxa"/>
-          </w:tcPr>
-          <w:p>
-            <w:pPr>
-              <w:pStyle w:val="Normal"/>
-              <w:spacing w:after="0" w:line="240" w:lineRule="auto"/>
-              <w:outlineLvl w:val="9"/>
-            </w:pPr>
-            <w:r>
-              <w:rPr>
-                <w:rFonts w:ascii="Times New Roman" w:hAnsi="Times New Roman" w:eastAsia="Times New Roman" w:cs="Times New Roman"/>
-                <w:color w:val="000000"/>
-                <w:sz w:val="24"/>
+            <w:tcW w:w="1872" w:type="dxa"/>
+          </w:tcPr>
+          <w:p>
+            <w:pPr>
+              <w:pStyle w:val="Normal"/>
+              <w:spacing w:after="0" w:line="240" w:lineRule="auto"/>
+              <w:outlineLvl w:val="9"/>
+            </w:pPr>
+            <w:r>
+              <w:rPr>
+                <w:rFonts w:ascii="Times New Roman" w:hAnsi="Times New Roman" w:eastAsia="Times New Roman" w:cs="Times New Roman"/>
+                <w:color w:val="000000"/>
+                <w:sz w:val="22"/>
                 <w:szCs w:val="24"/>
               </w:rPr>
               <w:t xml:space="preserve">INT</w:t>
@@ -1296,19 +1296,19 @@
         </w:tc>
         <w:tc>
           <w:tcPr>
-            <w:tcW w:w="700" w:type="dxa"/>
-          </w:tcPr>
-          <w:p>
-            <w:pPr>
-              <w:pStyle w:val="Normal"/>
-              <w:spacing w:after="0" w:line="240" w:lineRule="auto"/>
-              <w:outlineLvl w:val="9"/>
-            </w:pPr>
-            <w:r>
-              <w:rPr>
-                <w:rFonts w:ascii="Times New Roman" w:hAnsi="Times New Roman" w:eastAsia="Times New Roman" w:cs="Times New Roman"/>
-                <w:color w:val="000000"/>
-                <w:sz w:val="24"/>
+            <w:tcW w:w="950" w:type="dxa"/>
+          </w:tcPr>
+          <w:p>
+            <w:pPr>
+              <w:pStyle w:val="Normal"/>
+              <w:spacing w:after="0" w:line="240" w:lineRule="auto"/>
+              <w:outlineLvl w:val="9"/>
+            </w:pPr>
+            <w:r>
+              <w:rPr>
+                <w:rFonts w:ascii="Times New Roman" w:hAnsi="Times New Roman" w:eastAsia="Times New Roman" w:cs="Times New Roman"/>
+                <w:color w:val="000000"/>
+                <w:sz w:val="22"/>
                 <w:szCs w:val="24"/>
               </w:rPr>
               <w:t xml:space="preserve">Không</w:t>
@@ -1317,19 +1317,19 @@
         </w:tc>
         <w:tc>
           <w:tcPr>
-            <w:tcW w:w="1700" w:type="dxa"/>
-          </w:tcPr>
-          <w:p>
-            <w:pPr>
-              <w:pStyle w:val="Normal"/>
-              <w:spacing w:after="0" w:line="240" w:lineRule="auto"/>
-              <w:outlineLvl w:val="9"/>
-            </w:pPr>
-            <w:r>
-              <w:rPr>
-                <w:rFonts w:ascii="Times New Roman" w:hAnsi="Times New Roman" w:eastAsia="Times New Roman" w:cs="Times New Roman"/>
-                <w:color w:val="000000"/>
-                <w:sz w:val="24"/>
+            <w:tcW w:w="1843" w:type="dxa"/>
+          </w:tcPr>
+          <w:p>
+            <w:pPr>
+              <w:pStyle w:val="Normal"/>
+              <w:spacing w:after="0" w:line="240" w:lineRule="auto"/>
+              <w:outlineLvl w:val="9"/>
+            </w:pPr>
+            <w:r>
+              <w:rPr>
+                <w:rFonts w:ascii="Times New Roman" w:hAnsi="Times New Roman" w:eastAsia="Times New Roman" w:cs="Times New Roman"/>
+                <w:color w:val="000000"/>
+                <w:sz w:val="22"/>
                 <w:szCs w:val="24"/>
               </w:rPr>
               <w:t xml:space="preserve">IDENTITY(1,1)</w:t>
@@ -1338,19 +1338,19 @@
         </w:tc>
         <w:tc>
           <w:tcPr>
-            <w:tcW w:w="3850" w:type="dxa"/>
-          </w:tcPr>
-          <w:p>
-            <w:pPr>
-              <w:pStyle w:val="Normal"/>
-              <w:spacing w:after="0" w:line="240" w:lineRule="auto"/>
-              <w:outlineLvl w:val="9"/>
-            </w:pPr>
-            <w:r>
-              <w:rPr>
-                <w:rFonts w:ascii="Times New Roman" w:hAnsi="Times New Roman" w:eastAsia="Times New Roman" w:cs="Times New Roman"/>
-                <w:color w:val="000000"/>
-                <w:sz w:val="24"/>
+            <w:tcW w:w="2918" w:type="dxa"/>
+          </w:tcPr>
+          <w:p>
+            <w:pPr>
+              <w:pStyle w:val="Normal"/>
+              <w:spacing w:after="0" w:line="240" w:lineRule="auto"/>
+              <w:outlineLvl w:val="9"/>
+            </w:pPr>
+            <w:r>
+              <w:rPr>
+                <w:rFonts w:ascii="Times New Roman" w:hAnsi="Times New Roman" w:eastAsia="Times New Roman" w:cs="Times New Roman"/>
+                <w:color w:val="000000"/>
+                <w:sz w:val="22"/>
                 <w:szCs w:val="24"/>
               </w:rPr>
               <w:t xml:space="preserve">PK clustered; mã chi tiết</w:t>
@@ -1364,19 +1364,19 @@
         </w:trPr>
         <w:tc>
           <w:tcPr>
-            <w:tcW w:w="1900" w:type="dxa"/>
-          </w:tcPr>
-          <w:p>
-            <w:pPr>
-              <w:pStyle w:val="Normal"/>
-              <w:spacing w:after="0" w:line="240" w:lineRule="auto"/>
-              <w:outlineLvl w:val="9"/>
-            </w:pPr>
-            <w:r>
-              <w:rPr>
-                <w:rFonts w:ascii="Times New Roman" w:hAnsi="Times New Roman" w:eastAsia="Times New Roman" w:cs="Times New Roman"/>
-                <w:color w:val="000000"/>
-                <w:sz w:val="24"/>
+            <w:tcW w:w="2117" w:type="dxa"/>
+          </w:tcPr>
+          <w:p>
+            <w:pPr>
+              <w:pStyle w:val="Normal"/>
+              <w:spacing w:after="0" w:line="240" w:lineRule="auto"/>
+              <w:outlineLvl w:val="9"/>
+            </w:pPr>
+            <w:r>
+              <w:rPr>
+                <w:rFonts w:ascii="Times New Roman" w:hAnsi="Times New Roman" w:eastAsia="Times New Roman" w:cs="Times New Roman"/>
+                <w:color w:val="000000"/>
+                <w:sz w:val="22"/>
                 <w:szCs w:val="24"/>
               </w:rPr>
               <w:t xml:space="preserve">MaBangLuong</w:t>
@@ -1385,19 +1385,19 @@
         </w:tc>
         <w:tc>
           <w:tcPr>
-            <w:tcW w:w="1550" w:type="dxa"/>
-          </w:tcPr>
-          <w:p>
-            <w:pPr>
-              <w:pStyle w:val="Normal"/>
-              <w:spacing w:after="0" w:line="240" w:lineRule="auto"/>
-              <w:outlineLvl w:val="9"/>
-            </w:pPr>
-            <w:r>
-              <w:rPr>
-                <w:rFonts w:ascii="Times New Roman" w:hAnsi="Times New Roman" w:eastAsia="Times New Roman" w:cs="Times New Roman"/>
-                <w:color w:val="000000"/>
-                <w:sz w:val="24"/>
+            <w:tcW w:w="1872" w:type="dxa"/>
+          </w:tcPr>
+          <w:p>
+            <w:pPr>
+              <w:pStyle w:val="Normal"/>
+              <w:spacing w:after="0" w:line="240" w:lineRule="auto"/>
+              <w:outlineLvl w:val="9"/>
+            </w:pPr>
+            <w:r>
+              <w:rPr>
+                <w:rFonts w:ascii="Times New Roman" w:hAnsi="Times New Roman" w:eastAsia="Times New Roman" w:cs="Times New Roman"/>
+                <w:color w:val="000000"/>
+                <w:sz w:val="22"/>
                 <w:szCs w:val="24"/>
               </w:rPr>
               <w:t xml:space="preserve">INT</w:t>
@@ -1406,19 +1406,19 @@
         </w:tc>
         <w:tc>
           <w:tcPr>
-            <w:tcW w:w="700" w:type="dxa"/>
-          </w:tcPr>
-          <w:p>
-            <w:pPr>
-              <w:pStyle w:val="Normal"/>
-              <w:spacing w:after="0" w:line="240" w:lineRule="auto"/>
-              <w:outlineLvl w:val="9"/>
-            </w:pPr>
-            <w:r>
-              <w:rPr>
-                <w:rFonts w:ascii="Times New Roman" w:hAnsi="Times New Roman" w:eastAsia="Times New Roman" w:cs="Times New Roman"/>
-                <w:color w:val="000000"/>
-                <w:sz w:val="24"/>
+            <w:tcW w:w="950" w:type="dxa"/>
+          </w:tcPr>
+          <w:p>
+            <w:pPr>
+              <w:pStyle w:val="Normal"/>
+              <w:spacing w:after="0" w:line="240" w:lineRule="auto"/>
+              <w:outlineLvl w:val="9"/>
+            </w:pPr>
+            <w:r>
+              <w:rPr>
+                <w:rFonts w:ascii="Times New Roman" w:hAnsi="Times New Roman" w:eastAsia="Times New Roman" w:cs="Times New Roman"/>
+                <w:color w:val="000000"/>
+                <w:sz w:val="22"/>
                 <w:szCs w:val="24"/>
               </w:rPr>
               <w:t xml:space="preserve">Không</w:t>
@@ -1427,19 +1427,19 @@
         </w:tc>
         <w:tc>
           <w:tcPr>
-            <w:tcW w:w="1700" w:type="dxa"/>
-          </w:tcPr>
-          <w:p>
-            <w:pPr>
-              <w:pStyle w:val="Normal"/>
-              <w:spacing w:after="0" w:line="240" w:lineRule="auto"/>
-              <w:outlineLvl w:val="9"/>
-            </w:pPr>
-            <w:r>
-              <w:rPr>
-                <w:rFonts w:ascii="Times New Roman" w:hAnsi="Times New Roman" w:eastAsia="Times New Roman" w:cs="Times New Roman"/>
-                <w:color w:val="000000"/>
-                <w:sz w:val="24"/>
+            <w:tcW w:w="1843" w:type="dxa"/>
+          </w:tcPr>
+          <w:p>
+            <w:pPr>
+              <w:pStyle w:val="Normal"/>
+              <w:spacing w:after="0" w:line="240" w:lineRule="auto"/>
+              <w:outlineLvl w:val="9"/>
+            </w:pPr>
+            <w:r>
+              <w:rPr>
+                <w:rFonts w:ascii="Times New Roman" w:hAnsi="Times New Roman" w:eastAsia="Times New Roman" w:cs="Times New Roman"/>
+                <w:color w:val="000000"/>
+                <w:sz w:val="22"/>
                 <w:szCs w:val="24"/>
               </w:rPr>
               <w:t xml:space="preserve">Không</w:t>
@@ -1448,19 +1448,19 @@
         </w:tc>
         <w:tc>
           <w:tcPr>
-            <w:tcW w:w="3850" w:type="dxa"/>
-          </w:tcPr>
-          <w:p>
-            <w:pPr>
-              <w:pStyle w:val="Normal"/>
-              <w:spacing w:after="0" w:line="240" w:lineRule="auto"/>
-              <w:outlineLvl w:val="9"/>
-            </w:pPr>
-            <w:r>
-              <w:rPr>
-                <w:rFonts w:ascii="Times New Roman" w:hAnsi="Times New Roman" w:eastAsia="Times New Roman" w:cs="Times New Roman"/>
-                <w:color w:val="000000"/>
-                <w:sz w:val="24"/>
+            <w:tcW w:w="2918" w:type="dxa"/>
+          </w:tcPr>
+          <w:p>
+            <w:pPr>
+              <w:pStyle w:val="Normal"/>
+              <w:spacing w:after="0" w:line="240" w:lineRule="auto"/>
+              <w:outlineLvl w:val="9"/>
+            </w:pPr>
+            <w:r>
+              <w:rPr>
+                <w:rFonts w:ascii="Times New Roman" w:hAnsi="Times New Roman" w:eastAsia="Times New Roman" w:cs="Times New Roman"/>
+                <w:color w:val="000000"/>
+                <w:sz w:val="22"/>
                 <w:szCs w:val="24"/>
               </w:rPr>
               <w:t xml:space="preserve">FK → BANGLUONG.MaBangLuong</w:t>
@@ -1474,19 +1474,19 @@
         </w:trPr>
         <w:tc>
           <w:tcPr>
-            <w:tcW w:w="1900" w:type="dxa"/>
-          </w:tcPr>
-          <w:p>
-            <w:pPr>
-              <w:pStyle w:val="Normal"/>
-              <w:spacing w:after="0" w:line="240" w:lineRule="auto"/>
-              <w:outlineLvl w:val="9"/>
-            </w:pPr>
-            <w:r>
-              <w:rPr>
-                <w:rFonts w:ascii="Times New Roman" w:hAnsi="Times New Roman" w:eastAsia="Times New Roman" w:cs="Times New Roman"/>
-                <w:color w:val="000000"/>
-                <w:sz w:val="24"/>
+            <w:tcW w:w="2117" w:type="dxa"/>
+          </w:tcPr>
+          <w:p>
+            <w:pPr>
+              <w:pStyle w:val="Normal"/>
+              <w:spacing w:after="0" w:line="240" w:lineRule="auto"/>
+              <w:outlineLvl w:val="9"/>
+            </w:pPr>
+            <w:r>
+              <w:rPr>
+                <w:rFonts w:ascii="Times New Roman" w:hAnsi="Times New Roman" w:eastAsia="Times New Roman" w:cs="Times New Roman"/>
+                <w:color w:val="000000"/>
+                <w:sz w:val="22"/>
                 <w:szCs w:val="24"/>
               </w:rPr>
               <w:t xml:space="preserve">MaNV</w:t>
@@ -1495,19 +1495,19 @@
         </w:tc>
         <w:tc>
           <w:tcPr>
-            <w:tcW w:w="1550" w:type="dxa"/>
-          </w:tcPr>
-          <w:p>
-            <w:pPr>
-              <w:pStyle w:val="Normal"/>
-              <w:spacing w:after="0" w:line="240" w:lineRule="auto"/>
-              <w:outlineLvl w:val="9"/>
-            </w:pPr>
-            <w:r>
-              <w:rPr>
-                <w:rFonts w:ascii="Times New Roman" w:hAnsi="Times New Roman" w:eastAsia="Times New Roman" w:cs="Times New Roman"/>
-                <w:color w:val="000000"/>
-                <w:sz w:val="24"/>
+            <w:tcW w:w="1872" w:type="dxa"/>
+          </w:tcPr>
+          <w:p>
+            <w:pPr>
+              <w:pStyle w:val="Normal"/>
+              <w:spacing w:after="0" w:line="240" w:lineRule="auto"/>
+              <w:outlineLvl w:val="9"/>
+            </w:pPr>
+            <w:r>
+              <w:rPr>
+                <w:rFonts w:ascii="Times New Roman" w:hAnsi="Times New Roman" w:eastAsia="Times New Roman" w:cs="Times New Roman"/>
+                <w:color w:val="000000"/>
+                <w:sz w:val="22"/>
                 <w:szCs w:val="24"/>
               </w:rPr>
               <w:t xml:space="preserve">INT</w:t>
@@ -1516,19 +1516,19 @@
         </w:tc>
         <w:tc>
           <w:tcPr>
-            <w:tcW w:w="700" w:type="dxa"/>
-          </w:tcPr>
-          <w:p>
-            <w:pPr>
-              <w:pStyle w:val="Normal"/>
-              <w:spacing w:after="0" w:line="240" w:lineRule="auto"/>
-              <w:outlineLvl w:val="9"/>
-            </w:pPr>
-            <w:r>
-              <w:rPr>
-                <w:rFonts w:ascii="Times New Roman" w:hAnsi="Times New Roman" w:eastAsia="Times New Roman" w:cs="Times New Roman"/>
-                <w:color w:val="000000"/>
-                <w:sz w:val="24"/>
+            <w:tcW w:w="950" w:type="dxa"/>
+          </w:tcPr>
+          <w:p>
+            <w:pPr>
+              <w:pStyle w:val="Normal"/>
+              <w:spacing w:after="0" w:line="240" w:lineRule="auto"/>
+              <w:outlineLvl w:val="9"/>
+            </w:pPr>
+            <w:r>
+              <w:rPr>
+                <w:rFonts w:ascii="Times New Roman" w:hAnsi="Times New Roman" w:eastAsia="Times New Roman" w:cs="Times New Roman"/>
+                <w:color w:val="000000"/>
+                <w:sz w:val="22"/>
                 <w:szCs w:val="24"/>
               </w:rPr>
               <w:t xml:space="preserve">Không</w:t>
@@ -1537,19 +1537,19 @@
         </w:tc>
         <w:tc>
           <w:tcPr>
-            <w:tcW w:w="1700" w:type="dxa"/>
-          </w:tcPr>
-          <w:p>
-            <w:pPr>
-              <w:pStyle w:val="Normal"/>
-              <w:spacing w:after="0" w:line="240" w:lineRule="auto"/>
-              <w:outlineLvl w:val="9"/>
-            </w:pPr>
-            <w:r>
-              <w:rPr>
-                <w:rFonts w:ascii="Times New Roman" w:hAnsi="Times New Roman" w:eastAsia="Times New Roman" w:cs="Times New Roman"/>
-                <w:color w:val="000000"/>
-                <w:sz w:val="24"/>
+            <w:tcW w:w="1843" w:type="dxa"/>
+          </w:tcPr>
+          <w:p>
+            <w:pPr>
+              <w:pStyle w:val="Normal"/>
+              <w:spacing w:after="0" w:line="240" w:lineRule="auto"/>
+              <w:outlineLvl w:val="9"/>
+            </w:pPr>
+            <w:r>
+              <w:rPr>
+                <w:rFonts w:ascii="Times New Roman" w:hAnsi="Times New Roman" w:eastAsia="Times New Roman" w:cs="Times New Roman"/>
+                <w:color w:val="000000"/>
+                <w:sz w:val="22"/>
                 <w:szCs w:val="24"/>
               </w:rPr>
               <w:t xml:space="preserve">Không</w:t>
@@ -1558,19 +1558,19 @@
         </w:tc>
         <w:tc>
           <w:tcPr>
-            <w:tcW w:w="3850" w:type="dxa"/>
-          </w:tcPr>
-          <w:p>
-            <w:pPr>
-              <w:pStyle w:val="Normal"/>
-              <w:spacing w:after="0" w:line="240" w:lineRule="auto"/>
-              <w:outlineLvl w:val="9"/>
-            </w:pPr>
-            <w:r>
-              <w:rPr>
-                <w:rFonts w:ascii="Times New Roman" w:hAnsi="Times New Roman" w:eastAsia="Times New Roman" w:cs="Times New Roman"/>
-                <w:color w:val="000000"/>
-                <w:sz w:val="24"/>
+            <w:tcW w:w="2918" w:type="dxa"/>
+          </w:tcPr>
+          <w:p>
+            <w:pPr>
+              <w:pStyle w:val="Normal"/>
+              <w:spacing w:after="0" w:line="240" w:lineRule="auto"/>
+              <w:outlineLvl w:val="9"/>
+            </w:pPr>
+            <w:r>
+              <w:rPr>
+                <w:rFonts w:ascii="Times New Roman" w:hAnsi="Times New Roman" w:eastAsia="Times New Roman" w:cs="Times New Roman"/>
+                <w:color w:val="000000"/>
+                <w:sz w:val="22"/>
                 <w:szCs w:val="24"/>
               </w:rPr>
               <w:t xml:space="preserve">FK → NHANVIEN.MaNV</w:t>
@@ -1584,19 +1584,19 @@
         </w:trPr>
         <w:tc>
           <w:tcPr>
-            <w:tcW w:w="1900" w:type="dxa"/>
-          </w:tcPr>
-          <w:p>
-            <w:pPr>
-              <w:pStyle w:val="Normal"/>
-              <w:spacing w:after="0" w:line="240" w:lineRule="auto"/>
-              <w:outlineLvl w:val="9"/>
-            </w:pPr>
-            <w:r>
-              <w:rPr>
-                <w:rFonts w:ascii="Times New Roman" w:hAnsi="Times New Roman" w:eastAsia="Times New Roman" w:cs="Times New Roman"/>
-                <w:color w:val="000000"/>
-                <w:sz w:val="24"/>
+            <w:tcW w:w="2117" w:type="dxa"/>
+          </w:tcPr>
+          <w:p>
+            <w:pPr>
+              <w:pStyle w:val="Normal"/>
+              <w:spacing w:after="0" w:line="240" w:lineRule="auto"/>
+              <w:outlineLvl w:val="9"/>
+            </w:pPr>
+            <w:r>
+              <w:rPr>
+                <w:rFonts w:ascii="Times New Roman" w:hAnsi="Times New Roman" w:eastAsia="Times New Roman" w:cs="Times New Roman"/>
+                <w:color w:val="000000"/>
+                <w:sz w:val="22"/>
                 <w:szCs w:val="24"/>
               </w:rPr>
               <w:t xml:space="preserve">LuongCoBan</w:t>
@@ -1605,19 +1605,19 @@
         </w:tc>
         <w:tc>
           <w:tcPr>
-            <w:tcW w:w="1550" w:type="dxa"/>
-          </w:tcPr>
-          <w:p>
-            <w:pPr>
-              <w:pStyle w:val="Normal"/>
-              <w:spacing w:after="0" w:line="240" w:lineRule="auto"/>
-              <w:outlineLvl w:val="9"/>
-            </w:pPr>
-            <w:r>
-              <w:rPr>
-                <w:rFonts w:ascii="Times New Roman" w:hAnsi="Times New Roman" w:eastAsia="Times New Roman" w:cs="Times New Roman"/>
-                <w:color w:val="000000"/>
-                <w:sz w:val="24"/>
+            <w:tcW w:w="1872" w:type="dxa"/>
+          </w:tcPr>
+          <w:p>
+            <w:pPr>
+              <w:pStyle w:val="Normal"/>
+              <w:spacing w:after="0" w:line="240" w:lineRule="auto"/>
+              <w:outlineLvl w:val="9"/>
+            </w:pPr>
+            <w:r>
+              <w:rPr>
+                <w:rFonts w:ascii="Times New Roman" w:hAnsi="Times New Roman" w:eastAsia="Times New Roman" w:cs="Times New Roman"/>
+                <w:color w:val="000000"/>
+                <w:sz w:val="22"/>
                 <w:szCs w:val="24"/>
               </w:rPr>
               <w:t xml:space="preserve">DECIMAL(18,2)</w:t>
@@ -1626,19 +1626,19 @@
         </w:tc>
         <w:tc>
           <w:tcPr>
-            <w:tcW w:w="700" w:type="dxa"/>
-          </w:tcPr>
-          <w:p>
-            <w:pPr>
-              <w:pStyle w:val="Normal"/>
-              <w:spacing w:after="0" w:line="240" w:lineRule="auto"/>
-              <w:outlineLvl w:val="9"/>
-            </w:pPr>
-            <w:r>
-              <w:rPr>
-                <w:rFonts w:ascii="Times New Roman" w:hAnsi="Times New Roman" w:eastAsia="Times New Roman" w:cs="Times New Roman"/>
-                <w:color w:val="000000"/>
-                <w:sz w:val="24"/>
+            <w:tcW w:w="950" w:type="dxa"/>
+          </w:tcPr>
+          <w:p>
+            <w:pPr>
+              <w:pStyle w:val="Normal"/>
+              <w:spacing w:after="0" w:line="240" w:lineRule="auto"/>
+              <w:outlineLvl w:val="9"/>
+            </w:pPr>
+            <w:r>
+              <w:rPr>
+                <w:rFonts w:ascii="Times New Roman" w:hAnsi="Times New Roman" w:eastAsia="Times New Roman" w:cs="Times New Roman"/>
+                <w:color w:val="000000"/>
+                <w:sz w:val="22"/>
                 <w:szCs w:val="24"/>
               </w:rPr>
               <w:t xml:space="preserve">Không</w:t>
@@ -1647,19 +1647,19 @@
         </w:tc>
         <w:tc>
           <w:tcPr>
-            <w:tcW w:w="1700" w:type="dxa"/>
-          </w:tcPr>
-          <w:p>
-            <w:pPr>
-              <w:pStyle w:val="Normal"/>
-              <w:spacing w:after="0" w:line="240" w:lineRule="auto"/>
-              <w:outlineLvl w:val="9"/>
-            </w:pPr>
-            <w:r>
-              <w:rPr>
-                <w:rFonts w:ascii="Times New Roman" w:hAnsi="Times New Roman" w:eastAsia="Times New Roman" w:cs="Times New Roman"/>
-                <w:color w:val="000000"/>
-                <w:sz w:val="24"/>
+            <w:tcW w:w="1843" w:type="dxa"/>
+          </w:tcPr>
+          <w:p>
+            <w:pPr>
+              <w:pStyle w:val="Normal"/>
+              <w:spacing w:after="0" w:line="240" w:lineRule="auto"/>
+              <w:outlineLvl w:val="9"/>
+            </w:pPr>
+            <w:r>
+              <w:rPr>
+                <w:rFonts w:ascii="Times New Roman" w:hAnsi="Times New Roman" w:eastAsia="Times New Roman" w:cs="Times New Roman"/>
+                <w:color w:val="000000"/>
+                <w:sz w:val="22"/>
                 <w:szCs w:val="24"/>
               </w:rPr>
               <w:t xml:space="preserve">Không</w:t>
@@ -1668,19 +1668,19 @@
         </w:tc>
         <w:tc>
           <w:tcPr>
-            <w:tcW w:w="3850" w:type="dxa"/>
-          </w:tcPr>
-          <w:p>
-            <w:pPr>
-              <w:pStyle w:val="Normal"/>
-              <w:spacing w:after="0" w:line="240" w:lineRule="auto"/>
-              <w:outlineLvl w:val="9"/>
-            </w:pPr>
-            <w:r>
-              <w:rPr>
-                <w:rFonts w:ascii="Times New Roman" w:hAnsi="Times New Roman" w:eastAsia="Times New Roman" w:cs="Times New Roman"/>
-                <w:color w:val="000000"/>
-                <w:sz w:val="24"/>
+            <w:tcW w:w="2918" w:type="dxa"/>
+          </w:tcPr>
+          <w:p>
+            <w:pPr>
+              <w:pStyle w:val="Normal"/>
+              <w:spacing w:after="0" w:line="240" w:lineRule="auto"/>
+              <w:outlineLvl w:val="9"/>
+            </w:pPr>
+            <w:r>
+              <w:rPr>
+                <w:rFonts w:ascii="Times New Roman" w:hAnsi="Times New Roman" w:eastAsia="Times New Roman" w:cs="Times New Roman"/>
+                <w:color w:val="000000"/>
+                <w:sz w:val="22"/>
                 <w:szCs w:val="24"/>
               </w:rPr>
               <w:t xml:space="preserve">CHECK &gt;= 0; snapshot lương</w:t>
@@ -1694,19 +1694,19 @@
         </w:trPr>
         <w:tc>
           <w:tcPr>
-            <w:tcW w:w="1900" w:type="dxa"/>
-          </w:tcPr>
-          <w:p>
-            <w:pPr>
-              <w:pStyle w:val="Normal"/>
-              <w:spacing w:after="0" w:line="240" w:lineRule="auto"/>
-              <w:outlineLvl w:val="9"/>
-            </w:pPr>
-            <w:r>
-              <w:rPr>
-                <w:rFonts w:ascii="Times New Roman" w:hAnsi="Times New Roman" w:eastAsia="Times New Roman" w:cs="Times New Roman"/>
-                <w:color w:val="000000"/>
-                <w:sz w:val="24"/>
+            <w:tcW w:w="2117" w:type="dxa"/>
+          </w:tcPr>
+          <w:p>
+            <w:pPr>
+              <w:pStyle w:val="Normal"/>
+              <w:spacing w:after="0" w:line="240" w:lineRule="auto"/>
+              <w:outlineLvl w:val="9"/>
+            </w:pPr>
+            <w:r>
+              <w:rPr>
+                <w:rFonts w:ascii="Times New Roman" w:hAnsi="Times New Roman" w:eastAsia="Times New Roman" w:cs="Times New Roman"/>
+                <w:color w:val="000000"/>
+                <w:sz w:val="22"/>
                 <w:szCs w:val="24"/>
               </w:rPr>
               <w:t xml:space="preserve">NgayCongThucTe</w:t>
@@ -1715,19 +1715,19 @@
         </w:tc>
         <w:tc>
           <w:tcPr>
-            <w:tcW w:w="1550" w:type="dxa"/>
-          </w:tcPr>
-          <w:p>
-            <w:pPr>
-              <w:pStyle w:val="Normal"/>
-              <w:spacing w:after="0" w:line="240" w:lineRule="auto"/>
-              <w:outlineLvl w:val="9"/>
-            </w:pPr>
-            <w:r>
-              <w:rPr>
-                <w:rFonts w:ascii="Times New Roman" w:hAnsi="Times New Roman" w:eastAsia="Times New Roman" w:cs="Times New Roman"/>
-                <w:color w:val="000000"/>
-                <w:sz w:val="24"/>
+            <w:tcW w:w="1872" w:type="dxa"/>
+          </w:tcPr>
+          <w:p>
+            <w:pPr>
+              <w:pStyle w:val="Normal"/>
+              <w:spacing w:after="0" w:line="240" w:lineRule="auto"/>
+              <w:outlineLvl w:val="9"/>
+            </w:pPr>
+            <w:r>
+              <w:rPr>
+                <w:rFonts w:ascii="Times New Roman" w:hAnsi="Times New Roman" w:eastAsia="Times New Roman" w:cs="Times New Roman"/>
+                <w:color w:val="000000"/>
+                <w:sz w:val="22"/>
                 <w:szCs w:val="24"/>
               </w:rPr>
               <w:t xml:space="preserve">INT</w:t>
@@ -1736,19 +1736,19 @@
         </w:tc>
         <w:tc>
           <w:tcPr>
-            <w:tcW w:w="700" w:type="dxa"/>
-          </w:tcPr>
-          <w:p>
-            <w:pPr>
-              <w:pStyle w:val="Normal"/>
-              <w:spacing w:after="0" w:line="240" w:lineRule="auto"/>
-              <w:outlineLvl w:val="9"/>
-            </w:pPr>
-            <w:r>
-              <w:rPr>
-                <w:rFonts w:ascii="Times New Roman" w:hAnsi="Times New Roman" w:eastAsia="Times New Roman" w:cs="Times New Roman"/>
-                <w:color w:val="000000"/>
-                <w:sz w:val="24"/>
+            <w:tcW w:w="950" w:type="dxa"/>
+          </w:tcPr>
+          <w:p>
+            <w:pPr>
+              <w:pStyle w:val="Normal"/>
+              <w:spacing w:after="0" w:line="240" w:lineRule="auto"/>
+              <w:outlineLvl w:val="9"/>
+            </w:pPr>
+            <w:r>
+              <w:rPr>
+                <w:rFonts w:ascii="Times New Roman" w:hAnsi="Times New Roman" w:eastAsia="Times New Roman" w:cs="Times New Roman"/>
+                <w:color w:val="000000"/>
+                <w:sz w:val="22"/>
                 <w:szCs w:val="24"/>
               </w:rPr>
               <w:t xml:space="preserve">Không</w:t>
@@ -1757,19 +1757,19 @@
         </w:tc>
         <w:tc>
           <w:tcPr>
-            <w:tcW w:w="1700" w:type="dxa"/>
-          </w:tcPr>
-          <w:p>
-            <w:pPr>
-              <w:pStyle w:val="Normal"/>
-              <w:spacing w:after="0" w:line="240" w:lineRule="auto"/>
-              <w:outlineLvl w:val="9"/>
-            </w:pPr>
-            <w:r>
-              <w:rPr>
-                <w:rFonts w:ascii="Times New Roman" w:hAnsi="Times New Roman" w:eastAsia="Times New Roman" w:cs="Times New Roman"/>
-                <w:color w:val="000000"/>
-                <w:sz w:val="24"/>
+            <w:tcW w:w="1843" w:type="dxa"/>
+          </w:tcPr>
+          <w:p>
+            <w:pPr>
+              <w:pStyle w:val="Normal"/>
+              <w:spacing w:after="0" w:line="240" w:lineRule="auto"/>
+              <w:outlineLvl w:val="9"/>
+            </w:pPr>
+            <w:r>
+              <w:rPr>
+                <w:rFonts w:ascii="Times New Roman" w:hAnsi="Times New Roman" w:eastAsia="Times New Roman" w:cs="Times New Roman"/>
+                <w:color w:val="000000"/>
+                <w:sz w:val="22"/>
                 <w:szCs w:val="24"/>
               </w:rPr>
               <w:t xml:space="preserve">0</w:t>
@@ -1778,19 +1778,19 @@
         </w:tc>
         <w:tc>
           <w:tcPr>
-            <w:tcW w:w="3850" w:type="dxa"/>
-          </w:tcPr>
-          <w:p>
-            <w:pPr>
-              <w:pStyle w:val="Normal"/>
-              <w:spacing w:after="0" w:line="240" w:lineRule="auto"/>
-              <w:outlineLvl w:val="9"/>
-            </w:pPr>
-            <w:r>
-              <w:rPr>
-                <w:rFonts w:ascii="Times New Roman" w:hAnsi="Times New Roman" w:eastAsia="Times New Roman" w:cs="Times New Roman"/>
-                <w:color w:val="000000"/>
-                <w:sz w:val="24"/>
+            <w:tcW w:w="2918" w:type="dxa"/>
+          </w:tcPr>
+          <w:p>
+            <w:pPr>
+              <w:pStyle w:val="Normal"/>
+              <w:spacing w:after="0" w:line="240" w:lineRule="auto"/>
+              <w:outlineLvl w:val="9"/>
+            </w:pPr>
+            <w:r>
+              <w:rPr>
+                <w:rFonts w:ascii="Times New Roman" w:hAnsi="Times New Roman" w:eastAsia="Times New Roman" w:cs="Times New Roman"/>
+                <w:color w:val="000000"/>
+                <w:sz w:val="22"/>
                 <w:szCs w:val="24"/>
               </w:rPr>
               <w:t xml:space="preserve">CHECK &gt;= 0; số công hợp lệ</w:t>
@@ -1804,19 +1804,19 @@
         </w:trPr>
         <w:tc>
           <w:tcPr>
-            <w:tcW w:w="1900" w:type="dxa"/>
-          </w:tcPr>
-          <w:p>
-            <w:pPr>
-              <w:pStyle w:val="Normal"/>
-              <w:spacing w:after="0" w:line="240" w:lineRule="auto"/>
-              <w:outlineLvl w:val="9"/>
-            </w:pPr>
-            <w:r>
-              <w:rPr>
-                <w:rFonts w:ascii="Times New Roman" w:hAnsi="Times New Roman" w:eastAsia="Times New Roman" w:cs="Times New Roman"/>
-                <w:color w:val="000000"/>
-                <w:sz w:val="24"/>
+            <w:tcW w:w="2117" w:type="dxa"/>
+          </w:tcPr>
+          <w:p>
+            <w:pPr>
+              <w:pStyle w:val="Normal"/>
+              <w:spacing w:after="0" w:line="240" w:lineRule="auto"/>
+              <w:outlineLvl w:val="9"/>
+            </w:pPr>
+            <w:r>
+              <w:rPr>
+                <w:rFonts w:ascii="Times New Roman" w:hAnsi="Times New Roman" w:eastAsia="Times New Roman" w:cs="Times New Roman"/>
+                <w:color w:val="000000"/>
+                <w:sz w:val="22"/>
                 <w:szCs w:val="24"/>
               </w:rPr>
               <w:t xml:space="preserve">TienCong</w:t>
@@ -1825,19 +1825,19 @@
         </w:tc>
         <w:tc>
           <w:tcPr>
-            <w:tcW w:w="1550" w:type="dxa"/>
-          </w:tcPr>
-          <w:p>
-            <w:pPr>
-              <w:pStyle w:val="Normal"/>
-              <w:spacing w:after="0" w:line="240" w:lineRule="auto"/>
-              <w:outlineLvl w:val="9"/>
-            </w:pPr>
-            <w:r>
-              <w:rPr>
-                <w:rFonts w:ascii="Times New Roman" w:hAnsi="Times New Roman" w:eastAsia="Times New Roman" w:cs="Times New Roman"/>
-                <w:color w:val="000000"/>
-                <w:sz w:val="24"/>
+            <w:tcW w:w="1872" w:type="dxa"/>
+          </w:tcPr>
+          <w:p>
+            <w:pPr>
+              <w:pStyle w:val="Normal"/>
+              <w:spacing w:after="0" w:line="240" w:lineRule="auto"/>
+              <w:outlineLvl w:val="9"/>
+            </w:pPr>
+            <w:r>
+              <w:rPr>
+                <w:rFonts w:ascii="Times New Roman" w:hAnsi="Times New Roman" w:eastAsia="Times New Roman" w:cs="Times New Roman"/>
+                <w:color w:val="000000"/>
+                <w:sz w:val="22"/>
                 <w:szCs w:val="24"/>
               </w:rPr>
               <w:t xml:space="preserve">DECIMAL(18,2)</w:t>
@@ -1846,19 +1846,19 @@
         </w:tc>
         <w:tc>
           <w:tcPr>
-            <w:tcW w:w="700" w:type="dxa"/>
-          </w:tcPr>
-          <w:p>
-            <w:pPr>
-              <w:pStyle w:val="Normal"/>
-              <w:spacing w:after="0" w:line="240" w:lineRule="auto"/>
-              <w:outlineLvl w:val="9"/>
-            </w:pPr>
-            <w:r>
-              <w:rPr>
-                <w:rFonts w:ascii="Times New Roman" w:hAnsi="Times New Roman" w:eastAsia="Times New Roman" w:cs="Times New Roman"/>
-                <w:color w:val="000000"/>
-                <w:sz w:val="24"/>
+            <w:tcW w:w="950" w:type="dxa"/>
+          </w:tcPr>
+          <w:p>
+            <w:pPr>
+              <w:pStyle w:val="Normal"/>
+              <w:spacing w:after="0" w:line="240" w:lineRule="auto"/>
+              <w:outlineLvl w:val="9"/>
+            </w:pPr>
+            <w:r>
+              <w:rPr>
+                <w:rFonts w:ascii="Times New Roman" w:hAnsi="Times New Roman" w:eastAsia="Times New Roman" w:cs="Times New Roman"/>
+                <w:color w:val="000000"/>
+                <w:sz w:val="22"/>
                 <w:szCs w:val="24"/>
               </w:rPr>
               <w:t xml:space="preserve">Không</w:t>
@@ -1867,19 +1867,19 @@
         </w:tc>
         <w:tc>
           <w:tcPr>
-            <w:tcW w:w="1700" w:type="dxa"/>
-          </w:tcPr>
-          <w:p>
-            <w:pPr>
-              <w:pStyle w:val="Normal"/>
-              <w:spacing w:after="0" w:line="240" w:lineRule="auto"/>
-              <w:outlineLvl w:val="9"/>
-            </w:pPr>
-            <w:r>
-              <w:rPr>
-                <w:rFonts w:ascii="Times New Roman" w:hAnsi="Times New Roman" w:eastAsia="Times New Roman" w:cs="Times New Roman"/>
-                <w:color w:val="000000"/>
-                <w:sz w:val="24"/>
+            <w:tcW w:w="1843" w:type="dxa"/>
+          </w:tcPr>
+          <w:p>
+            <w:pPr>
+              <w:pStyle w:val="Normal"/>
+              <w:spacing w:after="0" w:line="240" w:lineRule="auto"/>
+              <w:outlineLvl w:val="9"/>
+            </w:pPr>
+            <w:r>
+              <w:rPr>
+                <w:rFonts w:ascii="Times New Roman" w:hAnsi="Times New Roman" w:eastAsia="Times New Roman" w:cs="Times New Roman"/>
+                <w:color w:val="000000"/>
+                <w:sz w:val="22"/>
                 <w:szCs w:val="24"/>
               </w:rPr>
               <w:t xml:space="preserve">0</w:t>
@@ -1888,19 +1888,19 @@
         </w:tc>
         <w:tc>
           <w:tcPr>
-            <w:tcW w:w="3850" w:type="dxa"/>
-          </w:tcPr>
-          <w:p>
-            <w:pPr>
-              <w:pStyle w:val="Normal"/>
-              <w:spacing w:after="0" w:line="240" w:lineRule="auto"/>
-              <w:outlineLvl w:val="9"/>
-            </w:pPr>
-            <w:r>
-              <w:rPr>
-                <w:rFonts w:ascii="Times New Roman" w:hAnsi="Times New Roman" w:eastAsia="Times New Roman" w:cs="Times New Roman"/>
-                <w:color w:val="000000"/>
-                <w:sz w:val="24"/>
+            <w:tcW w:w="2918" w:type="dxa"/>
+          </w:tcPr>
+          <w:p>
+            <w:pPr>
+              <w:pStyle w:val="Normal"/>
+              <w:spacing w:after="0" w:line="240" w:lineRule="auto"/>
+              <w:outlineLvl w:val="9"/>
+            </w:pPr>
+            <w:r>
+              <w:rPr>
+                <w:rFonts w:ascii="Times New Roman" w:hAnsi="Times New Roman" w:eastAsia="Times New Roman" w:cs="Times New Roman"/>
+                <w:color w:val="000000"/>
+                <w:sz w:val="22"/>
                 <w:szCs w:val="24"/>
               </w:rPr>
               <w:t xml:space="preserve">CHECK &gt;= 0; tiền công</w:t>
@@ -1914,19 +1914,19 @@
         </w:trPr>
         <w:tc>
           <w:tcPr>
-            <w:tcW w:w="1900" w:type="dxa"/>
-          </w:tcPr>
-          <w:p>
-            <w:pPr>
-              <w:pStyle w:val="Normal"/>
-              <w:spacing w:after="0" w:line="240" w:lineRule="auto"/>
-              <w:outlineLvl w:val="9"/>
-            </w:pPr>
-            <w:r>
-              <w:rPr>
-                <w:rFonts w:ascii="Times New Roman" w:hAnsi="Times New Roman" w:eastAsia="Times New Roman" w:cs="Times New Roman"/>
-                <w:color w:val="000000"/>
-                <w:sz w:val="24"/>
+            <w:tcW w:w="2117" w:type="dxa"/>
+          </w:tcPr>
+          <w:p>
+            <w:pPr>
+              <w:pStyle w:val="Normal"/>
+              <w:spacing w:after="0" w:line="240" w:lineRule="auto"/>
+              <w:outlineLvl w:val="9"/>
+            </w:pPr>
+            <w:r>
+              <w:rPr>
+                <w:rFonts w:ascii="Times New Roman" w:hAnsi="Times New Roman" w:eastAsia="Times New Roman" w:cs="Times New Roman"/>
+                <w:color w:val="000000"/>
+                <w:sz w:val="22"/>
                 <w:szCs w:val="24"/>
               </w:rPr>
               <w:t xml:space="preserve">TongPhuCap</w:t>
@@ -1935,19 +1935,19 @@
         </w:tc>
         <w:tc>
           <w:tcPr>
-            <w:tcW w:w="1550" w:type="dxa"/>
-          </w:tcPr>
-          <w:p>
-            <w:pPr>
-              <w:pStyle w:val="Normal"/>
-              <w:spacing w:after="0" w:line="240" w:lineRule="auto"/>
-              <w:outlineLvl w:val="9"/>
-            </w:pPr>
-            <w:r>
-              <w:rPr>
-                <w:rFonts w:ascii="Times New Roman" w:hAnsi="Times New Roman" w:eastAsia="Times New Roman" w:cs="Times New Roman"/>
-                <w:color w:val="000000"/>
-                <w:sz w:val="24"/>
+            <w:tcW w:w="1872" w:type="dxa"/>
+          </w:tcPr>
+          <w:p>
+            <w:pPr>
+              <w:pStyle w:val="Normal"/>
+              <w:spacing w:after="0" w:line="240" w:lineRule="auto"/>
+              <w:outlineLvl w:val="9"/>
+            </w:pPr>
+            <w:r>
+              <w:rPr>
+                <w:rFonts w:ascii="Times New Roman" w:hAnsi="Times New Roman" w:eastAsia="Times New Roman" w:cs="Times New Roman"/>
+                <w:color w:val="000000"/>
+                <w:sz w:val="22"/>
                 <w:szCs w:val="24"/>
               </w:rPr>
               <w:t xml:space="preserve">DECIMAL(18,2)</w:t>
@@ -1956,19 +1956,19 @@
         </w:tc>
         <w:tc>
           <w:tcPr>
-            <w:tcW w:w="700" w:type="dxa"/>
-          </w:tcPr>
-          <w:p>
-            <w:pPr>
-              <w:pStyle w:val="Normal"/>
-              <w:spacing w:after="0" w:line="240" w:lineRule="auto"/>
-              <w:outlineLvl w:val="9"/>
-            </w:pPr>
-            <w:r>
-              <w:rPr>
-                <w:rFonts w:ascii="Times New Roman" w:hAnsi="Times New Roman" w:eastAsia="Times New Roman" w:cs="Times New Roman"/>
-                <w:color w:val="000000"/>
-                <w:sz w:val="24"/>
+            <w:tcW w:w="950" w:type="dxa"/>
+          </w:tcPr>
+          <w:p>
+            <w:pPr>
+              <w:pStyle w:val="Normal"/>
+              <w:spacing w:after="0" w:line="240" w:lineRule="auto"/>
+              <w:outlineLvl w:val="9"/>
+            </w:pPr>
+            <w:r>
+              <w:rPr>
+                <w:rFonts w:ascii="Times New Roman" w:hAnsi="Times New Roman" w:eastAsia="Times New Roman" w:cs="Times New Roman"/>
+                <w:color w:val="000000"/>
+                <w:sz w:val="22"/>
                 <w:szCs w:val="24"/>
               </w:rPr>
               <w:t xml:space="preserve">Không</w:t>
@@ -1977,19 +1977,19 @@
         </w:tc>
         <w:tc>
           <w:tcPr>
-            <w:tcW w:w="1700" w:type="dxa"/>
-          </w:tcPr>
-          <w:p>
-            <w:pPr>
-              <w:pStyle w:val="Normal"/>
-              <w:spacing w:after="0" w:line="240" w:lineRule="auto"/>
-              <w:outlineLvl w:val="9"/>
-            </w:pPr>
-            <w:r>
-              <w:rPr>
-                <w:rFonts w:ascii="Times New Roman" w:hAnsi="Times New Roman" w:eastAsia="Times New Roman" w:cs="Times New Roman"/>
-                <w:color w:val="000000"/>
-                <w:sz w:val="24"/>
+            <w:tcW w:w="1843" w:type="dxa"/>
+          </w:tcPr>
+          <w:p>
+            <w:pPr>
+              <w:pStyle w:val="Normal"/>
+              <w:spacing w:after="0" w:line="240" w:lineRule="auto"/>
+              <w:outlineLvl w:val="9"/>
+            </w:pPr>
+            <w:r>
+              <w:rPr>
+                <w:rFonts w:ascii="Times New Roman" w:hAnsi="Times New Roman" w:eastAsia="Times New Roman" w:cs="Times New Roman"/>
+                <w:color w:val="000000"/>
+                <w:sz w:val="22"/>
                 <w:szCs w:val="24"/>
               </w:rPr>
               <w:t xml:space="preserve">0</w:t>
@@ -1998,19 +1998,19 @@
         </w:tc>
         <w:tc>
           <w:tcPr>
-            <w:tcW w:w="3850" w:type="dxa"/>
-          </w:tcPr>
-          <w:p>
-            <w:pPr>
-              <w:pStyle w:val="Normal"/>
-              <w:spacing w:after="0" w:line="240" w:lineRule="auto"/>
-              <w:outlineLvl w:val="9"/>
-            </w:pPr>
-            <w:r>
-              <w:rPr>
-                <w:rFonts w:ascii="Times New Roman" w:hAnsi="Times New Roman" w:eastAsia="Times New Roman" w:cs="Times New Roman"/>
-                <w:color w:val="000000"/>
-                <w:sz w:val="24"/>
+            <w:tcW w:w="2918" w:type="dxa"/>
+          </w:tcPr>
+          <w:p>
+            <w:pPr>
+              <w:pStyle w:val="Normal"/>
+              <w:spacing w:after="0" w:line="240" w:lineRule="auto"/>
+              <w:outlineLvl w:val="9"/>
+            </w:pPr>
+            <w:r>
+              <w:rPr>
+                <w:rFonts w:ascii="Times New Roman" w:hAnsi="Times New Roman" w:eastAsia="Times New Roman" w:cs="Times New Roman"/>
+                <w:color w:val="000000"/>
+                <w:sz w:val="22"/>
                 <w:szCs w:val="24"/>
               </w:rPr>
               <w:t xml:space="preserve">CHECK &gt;= 0; tổng phụ cấp</w:t>
@@ -2024,19 +2024,19 @@
         </w:trPr>
         <w:tc>
           <w:tcPr>
-            <w:tcW w:w="1900" w:type="dxa"/>
-          </w:tcPr>
-          <w:p>
-            <w:pPr>
-              <w:pStyle w:val="Normal"/>
-              <w:spacing w:after="0" w:line="240" w:lineRule="auto"/>
-              <w:outlineLvl w:val="9"/>
-            </w:pPr>
-            <w:r>
-              <w:rPr>
-                <w:rFonts w:ascii="Times New Roman" w:hAnsi="Times New Roman" w:eastAsia="Times New Roman" w:cs="Times New Roman"/>
-                <w:color w:val="000000"/>
-                <w:sz w:val="24"/>
+            <w:tcW w:w="2117" w:type="dxa"/>
+          </w:tcPr>
+          <w:p>
+            <w:pPr>
+              <w:pStyle w:val="Normal"/>
+              <w:spacing w:after="0" w:line="240" w:lineRule="auto"/>
+              <w:outlineLvl w:val="9"/>
+            </w:pPr>
+            <w:r>
+              <w:rPr>
+                <w:rFonts w:ascii="Times New Roman" w:hAnsi="Times New Roman" w:eastAsia="Times New Roman" w:cs="Times New Roman"/>
+                <w:color w:val="000000"/>
+                <w:sz w:val="22"/>
                 <w:szCs w:val="24"/>
               </w:rPr>
               <w:t xml:space="preserve">TongKhauTru</w:t>
@@ -2045,19 +2045,19 @@
         </w:tc>
         <w:tc>
           <w:tcPr>
-            <w:tcW w:w="1550" w:type="dxa"/>
-          </w:tcPr>
-          <w:p>
-            <w:pPr>
-              <w:pStyle w:val="Normal"/>
-              <w:spacing w:after="0" w:line="240" w:lineRule="auto"/>
-              <w:outlineLvl w:val="9"/>
-            </w:pPr>
-            <w:r>
-              <w:rPr>
-                <w:rFonts w:ascii="Times New Roman" w:hAnsi="Times New Roman" w:eastAsia="Times New Roman" w:cs="Times New Roman"/>
-                <w:color w:val="000000"/>
-                <w:sz w:val="24"/>
+            <w:tcW w:w="1872" w:type="dxa"/>
+          </w:tcPr>
+          <w:p>
+            <w:pPr>
+              <w:pStyle w:val="Normal"/>
+              <w:spacing w:after="0" w:line="240" w:lineRule="auto"/>
+              <w:outlineLvl w:val="9"/>
+            </w:pPr>
+            <w:r>
+              <w:rPr>
+                <w:rFonts w:ascii="Times New Roman" w:hAnsi="Times New Roman" w:eastAsia="Times New Roman" w:cs="Times New Roman"/>
+                <w:color w:val="000000"/>
+                <w:sz w:val="22"/>
                 <w:szCs w:val="24"/>
               </w:rPr>
               <w:t xml:space="preserve">DECIMAL(18,2)</w:t>
@@ -2066,19 +2066,19 @@
         </w:tc>
         <w:tc>
           <w:tcPr>
-            <w:tcW w:w="700" w:type="dxa"/>
-          </w:tcPr>
-          <w:p>
-            <w:pPr>
-              <w:pStyle w:val="Normal"/>
-              <w:spacing w:after="0" w:line="240" w:lineRule="auto"/>
-              <w:outlineLvl w:val="9"/>
-            </w:pPr>
-            <w:r>
-              <w:rPr>
-                <w:rFonts w:ascii="Times New Roman" w:hAnsi="Times New Roman" w:eastAsia="Times New Roman" w:cs="Times New Roman"/>
-                <w:color w:val="000000"/>
-                <w:sz w:val="24"/>
+            <w:tcW w:w="950" w:type="dxa"/>
+          </w:tcPr>
+          <w:p>
+            <w:pPr>
+              <w:pStyle w:val="Normal"/>
+              <w:spacing w:after="0" w:line="240" w:lineRule="auto"/>
+              <w:outlineLvl w:val="9"/>
+            </w:pPr>
+            <w:r>
+              <w:rPr>
+                <w:rFonts w:ascii="Times New Roman" w:hAnsi="Times New Roman" w:eastAsia="Times New Roman" w:cs="Times New Roman"/>
+                <w:color w:val="000000"/>
+                <w:sz w:val="22"/>
                 <w:szCs w:val="24"/>
               </w:rPr>
               <w:t xml:space="preserve">Không</w:t>
@@ -2087,19 +2087,19 @@
         </w:tc>
         <w:tc>
           <w:tcPr>
-            <w:tcW w:w="1700" w:type="dxa"/>
-          </w:tcPr>
-          <w:p>
-            <w:pPr>
-              <w:pStyle w:val="Normal"/>
-              <w:spacing w:after="0" w:line="240" w:lineRule="auto"/>
-              <w:outlineLvl w:val="9"/>
-            </w:pPr>
-            <w:r>
-              <w:rPr>
-                <w:rFonts w:ascii="Times New Roman" w:hAnsi="Times New Roman" w:eastAsia="Times New Roman" w:cs="Times New Roman"/>
-                <w:color w:val="000000"/>
-                <w:sz w:val="24"/>
+            <w:tcW w:w="1843" w:type="dxa"/>
+          </w:tcPr>
+          <w:p>
+            <w:pPr>
+              <w:pStyle w:val="Normal"/>
+              <w:spacing w:after="0" w:line="240" w:lineRule="auto"/>
+              <w:outlineLvl w:val="9"/>
+            </w:pPr>
+            <w:r>
+              <w:rPr>
+                <w:rFonts w:ascii="Times New Roman" w:hAnsi="Times New Roman" w:eastAsia="Times New Roman" w:cs="Times New Roman"/>
+                <w:color w:val="000000"/>
+                <w:sz w:val="22"/>
                 <w:szCs w:val="24"/>
               </w:rPr>
               <w:t xml:space="preserve">0</w:t>
@@ -2108,19 +2108,19 @@
         </w:tc>
         <w:tc>
           <w:tcPr>
-            <w:tcW w:w="3850" w:type="dxa"/>
-          </w:tcPr>
-          <w:p>
-            <w:pPr>
-              <w:pStyle w:val="Normal"/>
-              <w:spacing w:after="0" w:line="240" w:lineRule="auto"/>
-              <w:outlineLvl w:val="9"/>
-            </w:pPr>
-            <w:r>
-              <w:rPr>
-                <w:rFonts w:ascii="Times New Roman" w:hAnsi="Times New Roman" w:eastAsia="Times New Roman" w:cs="Times New Roman"/>
-                <w:color w:val="000000"/>
-                <w:sz w:val="24"/>
+            <w:tcW w:w="2918" w:type="dxa"/>
+          </w:tcPr>
+          <w:p>
+            <w:pPr>
+              <w:pStyle w:val="Normal"/>
+              <w:spacing w:after="0" w:line="240" w:lineRule="auto"/>
+              <w:outlineLvl w:val="9"/>
+            </w:pPr>
+            <w:r>
+              <w:rPr>
+                <w:rFonts w:ascii="Times New Roman" w:hAnsi="Times New Roman" w:eastAsia="Times New Roman" w:cs="Times New Roman"/>
+                <w:color w:val="000000"/>
+                <w:sz w:val="22"/>
                 <w:szCs w:val="24"/>
               </w:rPr>
               <w:t xml:space="preserve">CHECK &gt;= 0; tổng khoản trừ</w:t>
@@ -2134,19 +2134,19 @@
         </w:trPr>
         <w:tc>
           <w:tcPr>
-            <w:tcW w:w="1900" w:type="dxa"/>
-          </w:tcPr>
-          <w:p>
-            <w:pPr>
-              <w:pStyle w:val="Normal"/>
-              <w:spacing w:after="0" w:line="240" w:lineRule="auto"/>
-              <w:outlineLvl w:val="9"/>
-            </w:pPr>
-            <w:r>
-              <w:rPr>
-                <w:rFonts w:ascii="Times New Roman" w:hAnsi="Times New Roman" w:eastAsia="Times New Roman" w:cs="Times New Roman"/>
-                <w:color w:val="000000"/>
-                <w:sz w:val="24"/>
+            <w:tcW w:w="2117" w:type="dxa"/>
+          </w:tcPr>
+          <w:p>
+            <w:pPr>
+              <w:pStyle w:val="Normal"/>
+              <w:spacing w:after="0" w:line="240" w:lineRule="auto"/>
+              <w:outlineLvl w:val="9"/>
+            </w:pPr>
+            <w:r>
+              <w:rPr>
+                <w:rFonts w:ascii="Times New Roman" w:hAnsi="Times New Roman" w:eastAsia="Times New Roman" w:cs="Times New Roman"/>
+                <w:color w:val="000000"/>
+                <w:sz w:val="22"/>
                 <w:szCs w:val="24"/>
               </w:rPr>
               <w:t xml:space="preserve">ThucNhan</w:t>
@@ -2155,19 +2155,19 @@
         </w:tc>
         <w:tc>
           <w:tcPr>
-            <w:tcW w:w="1550" w:type="dxa"/>
-          </w:tcPr>
-          <w:p>
-            <w:pPr>
-              <w:pStyle w:val="Normal"/>
-              <w:spacing w:after="0" w:line="240" w:lineRule="auto"/>
-              <w:outlineLvl w:val="9"/>
-            </w:pPr>
-            <w:r>
-              <w:rPr>
-                <w:rFonts w:ascii="Times New Roman" w:hAnsi="Times New Roman" w:eastAsia="Times New Roman" w:cs="Times New Roman"/>
-                <w:color w:val="000000"/>
-                <w:sz w:val="24"/>
+            <w:tcW w:w="1872" w:type="dxa"/>
+          </w:tcPr>
+          <w:p>
+            <w:pPr>
+              <w:pStyle w:val="Normal"/>
+              <w:spacing w:after="0" w:line="240" w:lineRule="auto"/>
+              <w:outlineLvl w:val="9"/>
+            </w:pPr>
+            <w:r>
+              <w:rPr>
+                <w:rFonts w:ascii="Times New Roman" w:hAnsi="Times New Roman" w:eastAsia="Times New Roman" w:cs="Times New Roman"/>
+                <w:color w:val="000000"/>
+                <w:sz w:val="22"/>
                 <w:szCs w:val="24"/>
               </w:rPr>
               <w:t xml:space="preserve">DECIMAL(18,2)</w:t>
@@ -2176,19 +2176,19 @@
         </w:tc>
         <w:tc>
           <w:tcPr>
-            <w:tcW w:w="700" w:type="dxa"/>
-          </w:tcPr>
-          <w:p>
-            <w:pPr>
-              <w:pStyle w:val="Normal"/>
-              <w:spacing w:after="0" w:line="240" w:lineRule="auto"/>
-              <w:outlineLvl w:val="9"/>
-            </w:pPr>
-            <w:r>
-              <w:rPr>
-                <w:rFonts w:ascii="Times New Roman" w:hAnsi="Times New Roman" w:eastAsia="Times New Roman" w:cs="Times New Roman"/>
-                <w:color w:val="000000"/>
-                <w:sz w:val="24"/>
+            <w:tcW w:w="950" w:type="dxa"/>
+          </w:tcPr>
+          <w:p>
+            <w:pPr>
+              <w:pStyle w:val="Normal"/>
+              <w:spacing w:after="0" w:line="240" w:lineRule="auto"/>
+              <w:outlineLvl w:val="9"/>
+            </w:pPr>
+            <w:r>
+              <w:rPr>
+                <w:rFonts w:ascii="Times New Roman" w:hAnsi="Times New Roman" w:eastAsia="Times New Roman" w:cs="Times New Roman"/>
+                <w:color w:val="000000"/>
+                <w:sz w:val="22"/>
                 <w:szCs w:val="24"/>
               </w:rPr>
               <w:t xml:space="preserve">Không</w:t>
@@ -2197,19 +2197,19 @@
         </w:tc>
         <w:tc>
           <w:tcPr>
-            <w:tcW w:w="1700" w:type="dxa"/>
-          </w:tcPr>
-          <w:p>
-            <w:pPr>
-              <w:pStyle w:val="Normal"/>
-              <w:spacing w:after="0" w:line="240" w:lineRule="auto"/>
-              <w:outlineLvl w:val="9"/>
-            </w:pPr>
-            <w:r>
-              <w:rPr>
-                <w:rFonts w:ascii="Times New Roman" w:hAnsi="Times New Roman" w:eastAsia="Times New Roman" w:cs="Times New Roman"/>
-                <w:color w:val="000000"/>
-                <w:sz w:val="24"/>
+            <w:tcW w:w="1843" w:type="dxa"/>
+          </w:tcPr>
+          <w:p>
+            <w:pPr>
+              <w:pStyle w:val="Normal"/>
+              <w:spacing w:after="0" w:line="240" w:lineRule="auto"/>
+              <w:outlineLvl w:val="9"/>
+            </w:pPr>
+            <w:r>
+              <w:rPr>
+                <w:rFonts w:ascii="Times New Roman" w:hAnsi="Times New Roman" w:eastAsia="Times New Roman" w:cs="Times New Roman"/>
+                <w:color w:val="000000"/>
+                <w:sz w:val="22"/>
                 <w:szCs w:val="24"/>
               </w:rPr>
               <w:t xml:space="preserve">0</w:t>
@@ -2218,19 +2218,19 @@
         </w:tc>
         <w:tc>
           <w:tcPr>
-            <w:tcW w:w="3850" w:type="dxa"/>
-          </w:tcPr>
-          <w:p>
-            <w:pPr>
-              <w:pStyle w:val="Normal"/>
-              <w:spacing w:after="0" w:line="240" w:lineRule="auto"/>
-              <w:outlineLvl w:val="9"/>
-            </w:pPr>
-            <w:r>
-              <w:rPr>
-                <w:rFonts w:ascii="Times New Roman" w:hAnsi="Times New Roman" w:eastAsia="Times New Roman" w:cs="Times New Roman"/>
-                <w:color w:val="000000"/>
-                <w:sz w:val="24"/>
+            <w:tcW w:w="2918" w:type="dxa"/>
+          </w:tcPr>
+          <w:p>
+            <w:pPr>
+              <w:pStyle w:val="Normal"/>
+              <w:spacing w:after="0" w:line="240" w:lineRule="auto"/>
+              <w:outlineLvl w:val="9"/>
+            </w:pPr>
+            <w:r>
+              <w:rPr>
+                <w:rFonts w:ascii="Times New Roman" w:hAnsi="Times New Roman" w:eastAsia="Times New Roman" w:cs="Times New Roman"/>
+                <w:color w:val="000000"/>
+                <w:sz w:val="22"/>
                 <w:szCs w:val="24"/>
               </w:rPr>
               <w:t xml:space="preserve">Tiền nhận; được phép âm</w:t>

</xml_diff>